<commit_message>
update to admin added to yaml
</commit_message>
<xml_diff>
--- a/docs/api-reference.docx
+++ b/docs/api-reference.docx
@@ -52,7 +52,7 @@
         </w:p>
       </w:sdtContent>
     </w:sdt>
-    <w:bookmarkStart w:id="155" w:name="overview"/>
+    <w:bookmarkStart w:id="156" w:name="overview"/>
     <w:p>
       <w:pPr>
         <w:pStyle w:val="Heading1"/>
@@ -1464,7 +1464,7 @@
       </w:r>
     </w:p>
     <w:bookmarkEnd w:id="11"/>
-    <w:bookmarkStart w:id="36" w:name="user-api"/>
+    <w:bookmarkStart w:id="37" w:name="user-api"/>
     <w:p>
       <w:pPr>
         <w:pStyle w:val="Heading2"/>
@@ -2734,74 +2734,7 @@
         <w:t xml:space="preserve"> </w:t>
       </w:r>
       <w:r>
-        <w:t xml:space="preserve">event. Note: this route is wired in</w:t>
-      </w:r>
-      <w:r>
-        <w:t xml:space="preserve"> </w:t>
-      </w:r>
-      <w:r>
-        <w:rPr>
-          <w:rStyle w:val="VerbatimChar"/>
-        </w:rPr>
-        <w:t xml:space="preserve">lambdas/user/app.py</w:t>
-      </w:r>
-      <w:r>
-        <w:t xml:space="preserve"> </w:t>
-      </w:r>
-      <w:r>
-        <w:t xml:space="preserve">(</w:t>
-      </w:r>
-      <w:r>
-        <w:rPr>
-          <w:rStyle w:val="VerbatimChar"/>
-        </w:rPr>
-        <w:t xml:space="preserve">elif path == "/user/promote-admin"</w:t>
-      </w:r>
-      <w:r>
-        <w:t xml:space="preserve">) but is</w:t>
-      </w:r>
-      <w:r>
-        <w:t xml:space="preserve"> </w:t>
-      </w:r>
-      <w:r>
-        <w:rPr>
-          <w:b/>
-          <w:bCs/>
-        </w:rPr>
-        <w:t xml:space="preserve">not</w:t>
-      </w:r>
-      <w:r>
-        <w:t xml:space="preserve"> </w:t>
-      </w:r>
-      <w:r>
-        <w:t xml:space="preserve">currently declared as an API event in</w:t>
-      </w:r>
-      <w:r>
-        <w:t xml:space="preserve"> </w:t>
-      </w:r>
-      <w:r>
-        <w:rPr>
-          <w:rStyle w:val="VerbatimChar"/>
-        </w:rPr>
-        <w:t xml:space="preserve">template.yaml</w:t>
-      </w:r>
-      <w:r>
-        <w:t xml:space="preserve">’s</w:t>
-      </w:r>
-      <w:r>
-        <w:t xml:space="preserve"> </w:t>
-      </w:r>
-      <w:r>
-        <w:rPr>
-          <w:rStyle w:val="VerbatimChar"/>
-        </w:rPr>
-        <w:t xml:space="preserve">UserAuthFunction</w:t>
-      </w:r>
-      <w:r>
-        <w:t xml:space="preserve"> </w:t>
-      </w:r>
-      <w:r>
-        <w:t xml:space="preserve">resource.</w:t>
+        <w:t xml:space="preserve">event.</w:t>
       </w:r>
     </w:p>
     <w:bookmarkEnd w:id="16"/>
@@ -2918,17 +2851,441 @@
       <w:r>
         <w:t xml:space="preserve">—</w:t>
       </w:r>
-      <w:r>
-        <w:t xml:space="preserve"> </w:t>
-      </w:r>
-      <w:r>
-        <w:rPr>
-          <w:rStyle w:val="VerbatimChar"/>
-        </w:rPr>
-        <w:t xml:space="preserve">{ "message": "Login successful.", "token": "&lt;JWT, 1yr expiry&gt;", "user_id": &lt;id&gt;, "phone_number": ..., "accounts": [...] }</w:t>
-      </w:r>
-      <w:r>
-        <w:t xml:space="preserve">. The JWT payload contains</w:t>
+    </w:p>
+    <w:p>
+      <w:pPr>
+        <w:pStyle w:val="SourceCode"/>
+      </w:pPr>
+      <w:r>
+        <w:rPr>
+          <w:rStyle w:val="FunctionTok"/>
+        </w:rPr>
+        <w:t xml:space="preserve">{</w:t>
+      </w:r>
+      <w:r>
+        <w:br/>
+      </w:r>
+      <w:r>
+        <w:rPr>
+          <w:rStyle w:val="NormalTok"/>
+        </w:rPr>
+        <w:t xml:space="preserve">  </w:t>
+      </w:r>
+      <w:r>
+        <w:rPr>
+          <w:rStyle w:val="DataTypeTok"/>
+        </w:rPr>
+        <w:t xml:space="preserve">"message"</w:t>
+      </w:r>
+      <w:r>
+        <w:rPr>
+          <w:rStyle w:val="FunctionTok"/>
+        </w:rPr>
+        <w:t xml:space="preserve">:</w:t>
+      </w:r>
+      <w:r>
+        <w:rPr>
+          <w:rStyle w:val="NormalTok"/>
+        </w:rPr>
+        <w:t xml:space="preserve"> </w:t>
+      </w:r>
+      <w:r>
+        <w:rPr>
+          <w:rStyle w:val="StringTok"/>
+        </w:rPr>
+        <w:t xml:space="preserve">"Login successful."</w:t>
+      </w:r>
+      <w:r>
+        <w:rPr>
+          <w:rStyle w:val="FunctionTok"/>
+        </w:rPr>
+        <w:t xml:space="preserve">,</w:t>
+      </w:r>
+      <w:r>
+        <w:br/>
+      </w:r>
+      <w:r>
+        <w:rPr>
+          <w:rStyle w:val="NormalTok"/>
+        </w:rPr>
+        <w:t xml:space="preserve">  </w:t>
+      </w:r>
+      <w:r>
+        <w:rPr>
+          <w:rStyle w:val="DataTypeTok"/>
+        </w:rPr>
+        <w:t xml:space="preserve">"token"</w:t>
+      </w:r>
+      <w:r>
+        <w:rPr>
+          <w:rStyle w:val="FunctionTok"/>
+        </w:rPr>
+        <w:t xml:space="preserve">:</w:t>
+      </w:r>
+      <w:r>
+        <w:rPr>
+          <w:rStyle w:val="NormalTok"/>
+        </w:rPr>
+        <w:t xml:space="preserve"> </w:t>
+      </w:r>
+      <w:r>
+        <w:rPr>
+          <w:rStyle w:val="StringTok"/>
+        </w:rPr>
+        <w:t xml:space="preserve">"&lt;gate-access session JWT, 1yr expiry&gt;"</w:t>
+      </w:r>
+      <w:r>
+        <w:rPr>
+          <w:rStyle w:val="FunctionTok"/>
+        </w:rPr>
+        <w:t xml:space="preserve">,</w:t>
+      </w:r>
+      <w:r>
+        <w:br/>
+      </w:r>
+      <w:r>
+        <w:rPr>
+          <w:rStyle w:val="NormalTok"/>
+        </w:rPr>
+        <w:t xml:space="preserve">  </w:t>
+      </w:r>
+      <w:r>
+        <w:rPr>
+          <w:rStyle w:val="DataTypeTok"/>
+        </w:rPr>
+        <w:t xml:space="preserve">"user_id"</w:t>
+      </w:r>
+      <w:r>
+        <w:rPr>
+          <w:rStyle w:val="FunctionTok"/>
+        </w:rPr>
+        <w:t xml:space="preserve">:</w:t>
+      </w:r>
+      <w:r>
+        <w:rPr>
+          <w:rStyle w:val="NormalTok"/>
+        </w:rPr>
+        <w:t xml:space="preserve"> </w:t>
+      </w:r>
+      <w:r>
+        <w:rPr>
+          <w:rStyle w:val="ErrorTok"/>
+        </w:rPr>
+        <w:t xml:space="preserve">&lt;id&gt;</w:t>
+      </w:r>
+      <w:r>
+        <w:rPr>
+          <w:rStyle w:val="FunctionTok"/>
+        </w:rPr>
+        <w:t xml:space="preserve">,</w:t>
+      </w:r>
+      <w:r>
+        <w:br/>
+      </w:r>
+      <w:r>
+        <w:rPr>
+          <w:rStyle w:val="NormalTok"/>
+        </w:rPr>
+        <w:t xml:space="preserve">  </w:t>
+      </w:r>
+      <w:r>
+        <w:rPr>
+          <w:rStyle w:val="DataTypeTok"/>
+        </w:rPr>
+        <w:t xml:space="preserve">"phone_number"</w:t>
+      </w:r>
+      <w:r>
+        <w:rPr>
+          <w:rStyle w:val="FunctionTok"/>
+        </w:rPr>
+        <w:t xml:space="preserve">:</w:t>
+      </w:r>
+      <w:r>
+        <w:rPr>
+          <w:rStyle w:val="NormalTok"/>
+        </w:rPr>
+        <w:t xml:space="preserve"> </w:t>
+      </w:r>
+      <w:r>
+        <w:rPr>
+          <w:rStyle w:val="StringTok"/>
+        </w:rPr>
+        <w:t xml:space="preserve">"..."</w:t>
+      </w:r>
+      <w:r>
+        <w:rPr>
+          <w:rStyle w:val="FunctionTok"/>
+        </w:rPr>
+        <w:t xml:space="preserve">,</w:t>
+      </w:r>
+      <w:r>
+        <w:br/>
+      </w:r>
+      <w:r>
+        <w:rPr>
+          <w:rStyle w:val="NormalTok"/>
+        </w:rPr>
+        <w:t xml:space="preserve">  </w:t>
+      </w:r>
+      <w:r>
+        <w:rPr>
+          <w:rStyle w:val="DataTypeTok"/>
+        </w:rPr>
+        <w:t xml:space="preserve">"accounts"</w:t>
+      </w:r>
+      <w:r>
+        <w:rPr>
+          <w:rStyle w:val="FunctionTok"/>
+        </w:rPr>
+        <w:t xml:space="preserve">:</w:t>
+      </w:r>
+      <w:r>
+        <w:rPr>
+          <w:rStyle w:val="NormalTok"/>
+        </w:rPr>
+        <w:t xml:space="preserve"> </w:t>
+      </w:r>
+      <w:r>
+        <w:rPr>
+          <w:rStyle w:val="OtherTok"/>
+        </w:rPr>
+        <w:t xml:space="preserve">[</w:t>
+      </w:r>
+      <w:r>
+        <w:rPr>
+          <w:rStyle w:val="ErrorTok"/>
+        </w:rPr>
+        <w:t xml:space="preserve">...</w:t>
+      </w:r>
+      <w:r>
+        <w:rPr>
+          <w:rStyle w:val="OtherTok"/>
+        </w:rPr>
+        <w:t xml:space="preserve">]</w:t>
+      </w:r>
+      <w:r>
+        <w:rPr>
+          <w:rStyle w:val="FunctionTok"/>
+        </w:rPr>
+        <w:t xml:space="preserve">,</w:t>
+      </w:r>
+      <w:r>
+        <w:br/>
+      </w:r>
+      <w:r>
+        <w:rPr>
+          <w:rStyle w:val="NormalTok"/>
+        </w:rPr>
+        <w:t xml:space="preserve">  </w:t>
+      </w:r>
+      <w:r>
+        <w:rPr>
+          <w:rStyle w:val="DataTypeTok"/>
+        </w:rPr>
+        <w:t xml:space="preserve">"feedback_token"</w:t>
+      </w:r>
+      <w:r>
+        <w:rPr>
+          <w:rStyle w:val="FunctionTok"/>
+        </w:rPr>
+        <w:t xml:space="preserve">:</w:t>
+      </w:r>
+      <w:r>
+        <w:rPr>
+          <w:rStyle w:val="NormalTok"/>
+        </w:rPr>
+        <w:t xml:space="preserve"> </w:t>
+      </w:r>
+      <w:r>
+        <w:rPr>
+          <w:rStyle w:val="StringTok"/>
+        </w:rPr>
+        <w:t xml:space="preserve">"&lt;fihankra-feedback identity JWT, 1hr expiry&gt; | null"</w:t>
+      </w:r>
+      <w:r>
+        <w:rPr>
+          <w:rStyle w:val="FunctionTok"/>
+        </w:rPr>
+        <w:t xml:space="preserve">,</w:t>
+      </w:r>
+      <w:r>
+        <w:br/>
+      </w:r>
+      <w:r>
+        <w:rPr>
+          <w:rStyle w:val="NormalTok"/>
+        </w:rPr>
+        <w:t xml:space="preserve">  </w:t>
+      </w:r>
+      <w:r>
+        <w:rPr>
+          <w:rStyle w:val="DataTypeTok"/>
+        </w:rPr>
+        <w:t xml:space="preserve">"email"</w:t>
+      </w:r>
+      <w:r>
+        <w:rPr>
+          <w:rStyle w:val="FunctionTok"/>
+        </w:rPr>
+        <w:t xml:space="preserve">:</w:t>
+      </w:r>
+      <w:r>
+        <w:rPr>
+          <w:rStyle w:val="NormalTok"/>
+        </w:rPr>
+        <w:t xml:space="preserve"> </w:t>
+      </w:r>
+      <w:r>
+        <w:rPr>
+          <w:rStyle w:val="StringTok"/>
+        </w:rPr>
+        <w:t xml:space="preserve">"... | null"</w:t>
+      </w:r>
+      <w:r>
+        <w:rPr>
+          <w:rStyle w:val="FunctionTok"/>
+        </w:rPr>
+        <w:t xml:space="preserve">,</w:t>
+      </w:r>
+      <w:r>
+        <w:br/>
+      </w:r>
+      <w:r>
+        <w:rPr>
+          <w:rStyle w:val="NormalTok"/>
+        </w:rPr>
+        <w:t xml:space="preserve">  </w:t>
+      </w:r>
+      <w:r>
+        <w:rPr>
+          <w:rStyle w:val="DataTypeTok"/>
+        </w:rPr>
+        <w:t xml:space="preserve">"sub"</w:t>
+      </w:r>
+      <w:r>
+        <w:rPr>
+          <w:rStyle w:val="FunctionTok"/>
+        </w:rPr>
+        <w:t xml:space="preserve">:</w:t>
+      </w:r>
+      <w:r>
+        <w:rPr>
+          <w:rStyle w:val="NormalTok"/>
+        </w:rPr>
+        <w:t xml:space="preserve"> </w:t>
+      </w:r>
+      <w:r>
+        <w:rPr>
+          <w:rStyle w:val="StringTok"/>
+        </w:rPr>
+        <w:t xml:space="preserve">"&lt;user_id as string&gt; | null"</w:t>
+      </w:r>
+      <w:r>
+        <w:rPr>
+          <w:rStyle w:val="FunctionTok"/>
+        </w:rPr>
+        <w:t xml:space="preserve">,</w:t>
+      </w:r>
+      <w:r>
+        <w:br/>
+      </w:r>
+      <w:r>
+        <w:rPr>
+          <w:rStyle w:val="NormalTok"/>
+        </w:rPr>
+        <w:t xml:space="preserve">  </w:t>
+      </w:r>
+      <w:r>
+        <w:rPr>
+          <w:rStyle w:val="DataTypeTok"/>
+        </w:rPr>
+        <w:t xml:space="preserve">"sourceKeys"</w:t>
+      </w:r>
+      <w:r>
+        <w:rPr>
+          <w:rStyle w:val="FunctionTok"/>
+        </w:rPr>
+        <w:t xml:space="preserve">:</w:t>
+      </w:r>
+      <w:r>
+        <w:rPr>
+          <w:rStyle w:val="NormalTok"/>
+        </w:rPr>
+        <w:t xml:space="preserve"> </w:t>
+      </w:r>
+      <w:r>
+        <w:rPr>
+          <w:rStyle w:val="OtherTok"/>
+        </w:rPr>
+        <w:t xml:space="preserve">[</w:t>
+      </w:r>
+      <w:r>
+        <w:rPr>
+          <w:rStyle w:val="StringTok"/>
+        </w:rPr>
+        <w:t xml:space="preserve">"fihankra-feedback"</w:t>
+      </w:r>
+      <w:r>
+        <w:rPr>
+          <w:rStyle w:val="OtherTok"/>
+        </w:rPr>
+        <w:t xml:space="preserve">]</w:t>
+      </w:r>
+      <w:r>
+        <w:rPr>
+          <w:rStyle w:val="NormalTok"/>
+        </w:rPr>
+        <w:t xml:space="preserve"> </w:t>
+      </w:r>
+      <w:r>
+        <w:rPr>
+          <w:rStyle w:val="ErrorTok"/>
+        </w:rPr>
+        <w:t xml:space="preserve">|</w:t>
+      </w:r>
+      <w:r>
+        <w:rPr>
+          <w:rStyle w:val="NormalTok"/>
+        </w:rPr>
+        <w:t xml:space="preserve"> </w:t>
+      </w:r>
+      <w:r>
+        <w:rPr>
+          <w:rStyle w:val="KeywordTok"/>
+        </w:rPr>
+        <w:t xml:space="preserve">null</w:t>
+      </w:r>
+      <w:r>
+        <w:br/>
+      </w:r>
+      <w:r>
+        <w:rPr>
+          <w:rStyle w:val="FunctionTok"/>
+        </w:rPr>
+        <w:t xml:space="preserve">}</w:t>
+      </w:r>
+    </w:p>
+    <w:p>
+      <w:pPr>
+        <w:pStyle w:val="FirstParagraph"/>
+      </w:pPr>
+      <w:r>
+        <w:t xml:space="preserve">The</w:t>
+      </w:r>
+      <w:r>
+        <w:t xml:space="preserve"> </w:t>
+      </w:r>
+      <w:r>
+        <w:rPr>
+          <w:rStyle w:val="VerbatimChar"/>
+        </w:rPr>
+        <w:t xml:space="preserve">token</w:t>
+      </w:r>
+      <w:r>
+        <w:t xml:space="preserve"> </w:t>
+      </w:r>
+      <w:r>
+        <w:t xml:space="preserve">JWT payload contains</w:t>
       </w:r>
       <w:r>
         <w:t xml:space="preserve"> </w:t>
@@ -2988,6 +3345,219 @@
       </w:pPr>
       <w:r>
         <w:rPr>
+          <w:rStyle w:val="VerbatimChar"/>
+        </w:rPr>
+        <w:t xml:space="preserve">feedback_token</w:t>
+      </w:r>
+      <w:r>
+        <w:t xml:space="preserve">/</w:t>
+      </w:r>
+      <w:r>
+        <w:rPr>
+          <w:rStyle w:val="VerbatimChar"/>
+        </w:rPr>
+        <w:t xml:space="preserve">email</w:t>
+      </w:r>
+      <w:r>
+        <w:t xml:space="preserve">/</w:t>
+      </w:r>
+      <w:r>
+        <w:rPr>
+          <w:rStyle w:val="VerbatimChar"/>
+        </w:rPr>
+        <w:t xml:space="preserve">sub</w:t>
+      </w:r>
+      <w:r>
+        <w:t xml:space="preserve">/</w:t>
+      </w:r>
+      <w:r>
+        <w:rPr>
+          <w:rStyle w:val="VerbatimChar"/>
+        </w:rPr>
+        <w:t xml:space="preserve">sourceKeys</w:t>
+      </w:r>
+      <w:r>
+        <w:t xml:space="preserve"> </w:t>
+      </w:r>
+      <w:r>
+        <w:t xml:space="preserve">are a separate identity token pair for the third-party</w:t>
+      </w:r>
+      <w:r>
+        <w:t xml:space="preserve"> </w:t>
+      </w:r>
+      <w:r>
+        <w:rPr>
+          <w:b/>
+          <w:bCs/>
+        </w:rPr>
+        <w:t xml:space="preserve">fihankra-feedback</w:t>
+      </w:r>
+      <w:r>
+        <w:t xml:space="preserve"> </w:t>
+      </w:r>
+      <w:r>
+        <w:t xml:space="preserve">embed, signed with a different shared secret (</w:t>
+      </w:r>
+      <w:r>
+        <w:rPr>
+          <w:rStyle w:val="VerbatimChar"/>
+        </w:rPr>
+        <w:t xml:space="preserve">FIHANKRA_FEEDBACK_SECRET</w:t>
+      </w:r>
+      <w:r>
+        <w:t xml:space="preserve">, unrelated to the app’s own</w:t>
+      </w:r>
+      <w:r>
+        <w:t xml:space="preserve"> </w:t>
+      </w:r>
+      <w:r>
+        <w:rPr>
+          <w:rStyle w:val="VerbatimChar"/>
+        </w:rPr>
+        <w:t xml:space="preserve">JWT_SECRET</w:t>
+      </w:r>
+      <w:r>
+        <w:t xml:space="preserve">). They’re populated only when the logging-in user is a global admin (</w:t>
+      </w:r>
+      <w:r>
+        <w:rPr>
+          <w:rStyle w:val="VerbatimChar"/>
+        </w:rPr>
+        <w:t xml:space="preserve">is_admin=true</w:t>
+      </w:r>
+      <w:r>
+        <w:t xml:space="preserve">) or an estate admin (has an</w:t>
+      </w:r>
+      <w:r>
+        <w:t xml:space="preserve"> </w:t>
+      </w:r>
+      <w:r>
+        <w:rPr>
+          <w:rStyle w:val="VerbatimChar"/>
+        </w:rPr>
+        <w:t xml:space="preserve">account_holders</w:t>
+      </w:r>
+      <w:r>
+        <w:t xml:space="preserve"> </w:t>
+      </w:r>
+      <w:r>
+        <w:t xml:space="preserve">row with</w:t>
+      </w:r>
+      <w:r>
+        <w:t xml:space="preserve"> </w:t>
+      </w:r>
+      <w:r>
+        <w:rPr>
+          <w:rStyle w:val="VerbatimChar"/>
+        </w:rPr>
+        <w:t xml:space="preserve">account_types.name = 'ADMIN'</w:t>
+      </w:r>
+      <w:r>
+        <w:t xml:space="preserve"> </w:t>
+      </w:r>
+      <w:r>
+        <w:t xml:space="preserve">in any estate) —</w:t>
+      </w:r>
+      <w:r>
+        <w:t xml:space="preserve"> </w:t>
+      </w:r>
+      <w:r>
+        <w:rPr>
+          <w:rStyle w:val="VerbatimChar"/>
+        </w:rPr>
+        <w:t xml:space="preserve">null</w:t>
+      </w:r>
+      <w:r>
+        <w:t xml:space="preserve"> </w:t>
+      </w:r>
+      <w:r>
+        <w:t xml:space="preserve">for everyone else, and also</w:t>
+      </w:r>
+      <w:r>
+        <w:t xml:space="preserve"> </w:t>
+      </w:r>
+      <w:r>
+        <w:rPr>
+          <w:rStyle w:val="VerbatimChar"/>
+        </w:rPr>
+        <w:t xml:space="preserve">null</w:t>
+      </w:r>
+      <w:r>
+        <w:t xml:space="preserve"> </w:t>
+      </w:r>
+      <w:r>
+        <w:t xml:space="preserve">if</w:t>
+      </w:r>
+      <w:r>
+        <w:t xml:space="preserve"> </w:t>
+      </w:r>
+      <w:r>
+        <w:rPr>
+          <w:rStyle w:val="VerbatimChar"/>
+        </w:rPr>
+        <w:t xml:space="preserve">FIHANKRA_FEEDBACK_SECRET</w:t>
+      </w:r>
+      <w:r>
+        <w:t xml:space="preserve"> </w:t>
+      </w:r>
+      <w:r>
+        <w:t xml:space="preserve">isn’t configured.</w:t>
+      </w:r>
+      <w:r>
+        <w:t xml:space="preserve"> </w:t>
+      </w:r>
+      <w:r>
+        <w:rPr>
+          <w:rStyle w:val="VerbatimChar"/>
+        </w:rPr>
+        <w:t xml:space="preserve">email</w:t>
+      </w:r>
+      <w:r>
+        <w:t xml:space="preserve">/</w:t>
+      </w:r>
+      <w:r>
+        <w:rPr>
+          <w:rStyle w:val="VerbatimChar"/>
+        </w:rPr>
+        <w:t xml:space="preserve">sub</w:t>
+      </w:r>
+      <w:r>
+        <w:t xml:space="preserve">/</w:t>
+      </w:r>
+      <w:r>
+        <w:rPr>
+          <w:rStyle w:val="VerbatimChar"/>
+        </w:rPr>
+        <w:t xml:space="preserve">sourceKeys</w:t>
+      </w:r>
+      <w:r>
+        <w:t xml:space="preserve"> </w:t>
+      </w:r>
+      <w:r>
+        <w:t xml:space="preserve">mirror the claims embedded inside</w:t>
+      </w:r>
+      <w:r>
+        <w:t xml:space="preserve"> </w:t>
+      </w:r>
+      <w:r>
+        <w:rPr>
+          <w:rStyle w:val="VerbatimChar"/>
+        </w:rPr>
+        <w:t xml:space="preserve">feedback_token</w:t>
+      </w:r>
+      <w:r>
+        <w:t xml:space="preserve"> </w:t>
+      </w:r>
+      <w:r>
+        <w:t xml:space="preserve">itself, provided as plain fields so the frontend doesn’t need to decode the JWT to read them.</w:t>
+      </w:r>
+    </w:p>
+    <w:p>
+      <w:pPr>
+        <w:pStyle w:val="BodyText"/>
+      </w:pPr>
+      <w:r>
+        <w:rPr>
           <w:b/>
           <w:bCs/>
         </w:rPr>
@@ -3078,12 +3648,437 @@
       </w:r>
     </w:p>
     <w:bookmarkEnd w:id="17"/>
-    <w:bookmarkStart w:id="18" w:name="post-userchange_password"/>
+    <w:bookmarkStart w:id="18" w:name="post-userfeedback_tokenrefresh"/>
     <w:p>
       <w:pPr>
         <w:pStyle w:val="Heading3"/>
       </w:pPr>
       <w:r>
+        <w:t xml:space="preserve">POST /user/feedback_token/refresh</w:t>
+      </w:r>
+    </w:p>
+    <w:p>
+      <w:pPr>
+        <w:pStyle w:val="FirstParagraph"/>
+      </w:pPr>
+      <w:r>
+        <w:rPr>
+          <w:b/>
+          <w:bCs/>
+        </w:rPr>
+        <w:t xml:space="preserve">Auth</w:t>
+      </w:r>
+      <w:r>
+        <w:t xml:space="preserve">: requires Bearer JWT (the normal gate-access session token, not a device token — the payload must carry</w:t>
+      </w:r>
+      <w:r>
+        <w:t xml:space="preserve"> </w:t>
+      </w:r>
+      <w:r>
+        <w:rPr>
+          <w:rStyle w:val="VerbatimChar"/>
+        </w:rPr>
+        <w:t xml:space="preserve">user_id</w:t>
+      </w:r>
+      <w:r>
+        <w:t xml:space="preserve">).</w:t>
+      </w:r>
+    </w:p>
+    <w:p>
+      <w:pPr>
+        <w:pStyle w:val="BodyText"/>
+      </w:pPr>
+      <w:r>
+        <w:rPr>
+          <w:b/>
+          <w:bCs/>
+        </w:rPr>
+        <w:t xml:space="preserve">Request body</w:t>
+      </w:r>
+      <w:r>
+        <w:t xml:space="preserve">: none.</w:t>
+      </w:r>
+    </w:p>
+    <w:p>
+      <w:pPr>
+        <w:pStyle w:val="BodyText"/>
+      </w:pPr>
+      <w:r>
+        <w:rPr>
+          <w:b/>
+          <w:bCs/>
+        </w:rPr>
+        <w:t xml:space="preserve">Success response</w:t>
+      </w:r>
+      <w:r>
+        <w:t xml:space="preserve">:</w:t>
+      </w:r>
+      <w:r>
+        <w:t xml:space="preserve"> </w:t>
+      </w:r>
+      <w:r>
+        <w:rPr>
+          <w:rStyle w:val="VerbatimChar"/>
+        </w:rPr>
+        <w:t xml:space="preserve">200</w:t>
+      </w:r>
+      <w:r>
+        <w:t xml:space="preserve"> </w:t>
+      </w:r>
+      <w:r>
+        <w:t xml:space="preserve">—</w:t>
+      </w:r>
+    </w:p>
+    <w:p>
+      <w:pPr>
+        <w:pStyle w:val="SourceCode"/>
+      </w:pPr>
+      <w:r>
+        <w:rPr>
+          <w:rStyle w:val="FunctionTok"/>
+        </w:rPr>
+        <w:t xml:space="preserve">{</w:t>
+      </w:r>
+      <w:r>
+        <w:br/>
+      </w:r>
+      <w:r>
+        <w:rPr>
+          <w:rStyle w:val="NormalTok"/>
+        </w:rPr>
+        <w:t xml:space="preserve">  </w:t>
+      </w:r>
+      <w:r>
+        <w:rPr>
+          <w:rStyle w:val="DataTypeTok"/>
+        </w:rPr>
+        <w:t xml:space="preserve">"feedback_token"</w:t>
+      </w:r>
+      <w:r>
+        <w:rPr>
+          <w:rStyle w:val="FunctionTok"/>
+        </w:rPr>
+        <w:t xml:space="preserve">:</w:t>
+      </w:r>
+      <w:r>
+        <w:rPr>
+          <w:rStyle w:val="NormalTok"/>
+        </w:rPr>
+        <w:t xml:space="preserve"> </w:t>
+      </w:r>
+      <w:r>
+        <w:rPr>
+          <w:rStyle w:val="StringTok"/>
+        </w:rPr>
+        <w:t xml:space="preserve">"&lt;fihankra-feedback identity JWT, fresh 1hr expiry&gt;"</w:t>
+      </w:r>
+      <w:r>
+        <w:rPr>
+          <w:rStyle w:val="FunctionTok"/>
+        </w:rPr>
+        <w:t xml:space="preserve">,</w:t>
+      </w:r>
+      <w:r>
+        <w:br/>
+      </w:r>
+      <w:r>
+        <w:rPr>
+          <w:rStyle w:val="NormalTok"/>
+        </w:rPr>
+        <w:t xml:space="preserve">  </w:t>
+      </w:r>
+      <w:r>
+        <w:rPr>
+          <w:rStyle w:val="DataTypeTok"/>
+        </w:rPr>
+        <w:t xml:space="preserve">"email"</w:t>
+      </w:r>
+      <w:r>
+        <w:rPr>
+          <w:rStyle w:val="FunctionTok"/>
+        </w:rPr>
+        <w:t xml:space="preserve">:</w:t>
+      </w:r>
+      <w:r>
+        <w:rPr>
+          <w:rStyle w:val="NormalTok"/>
+        </w:rPr>
+        <w:t xml:space="preserve"> </w:t>
+      </w:r>
+      <w:r>
+        <w:rPr>
+          <w:rStyle w:val="StringTok"/>
+        </w:rPr>
+        <w:t xml:space="preserve">"..."</w:t>
+      </w:r>
+      <w:r>
+        <w:rPr>
+          <w:rStyle w:val="FunctionTok"/>
+        </w:rPr>
+        <w:t xml:space="preserve">,</w:t>
+      </w:r>
+      <w:r>
+        <w:br/>
+      </w:r>
+      <w:r>
+        <w:rPr>
+          <w:rStyle w:val="NormalTok"/>
+        </w:rPr>
+        <w:t xml:space="preserve">  </w:t>
+      </w:r>
+      <w:r>
+        <w:rPr>
+          <w:rStyle w:val="DataTypeTok"/>
+        </w:rPr>
+        <w:t xml:space="preserve">"sub"</w:t>
+      </w:r>
+      <w:r>
+        <w:rPr>
+          <w:rStyle w:val="FunctionTok"/>
+        </w:rPr>
+        <w:t xml:space="preserve">:</w:t>
+      </w:r>
+      <w:r>
+        <w:rPr>
+          <w:rStyle w:val="NormalTok"/>
+        </w:rPr>
+        <w:t xml:space="preserve"> </w:t>
+      </w:r>
+      <w:r>
+        <w:rPr>
+          <w:rStyle w:val="StringTok"/>
+        </w:rPr>
+        <w:t xml:space="preserve">"&lt;user_id as string&gt;"</w:t>
+      </w:r>
+      <w:r>
+        <w:rPr>
+          <w:rStyle w:val="FunctionTok"/>
+        </w:rPr>
+        <w:t xml:space="preserve">,</w:t>
+      </w:r>
+      <w:r>
+        <w:br/>
+      </w:r>
+      <w:r>
+        <w:rPr>
+          <w:rStyle w:val="NormalTok"/>
+        </w:rPr>
+        <w:t xml:space="preserve">  </w:t>
+      </w:r>
+      <w:r>
+        <w:rPr>
+          <w:rStyle w:val="DataTypeTok"/>
+        </w:rPr>
+        <w:t xml:space="preserve">"sourceKeys"</w:t>
+      </w:r>
+      <w:r>
+        <w:rPr>
+          <w:rStyle w:val="FunctionTok"/>
+        </w:rPr>
+        <w:t xml:space="preserve">:</w:t>
+      </w:r>
+      <w:r>
+        <w:rPr>
+          <w:rStyle w:val="NormalTok"/>
+        </w:rPr>
+        <w:t xml:space="preserve"> </w:t>
+      </w:r>
+      <w:r>
+        <w:rPr>
+          <w:rStyle w:val="OtherTok"/>
+        </w:rPr>
+        <w:t xml:space="preserve">[</w:t>
+      </w:r>
+      <w:r>
+        <w:rPr>
+          <w:rStyle w:val="StringTok"/>
+        </w:rPr>
+        <w:t xml:space="preserve">"fihankra-feedback"</w:t>
+      </w:r>
+      <w:r>
+        <w:rPr>
+          <w:rStyle w:val="OtherTok"/>
+        </w:rPr>
+        <w:t xml:space="preserve">]</w:t>
+      </w:r>
+      <w:r>
+        <w:br/>
+      </w:r>
+      <w:r>
+        <w:rPr>
+          <w:rStyle w:val="FunctionTok"/>
+        </w:rPr>
+        <w:t xml:space="preserve">}</w:t>
+      </w:r>
+    </w:p>
+    <w:p>
+      <w:pPr>
+        <w:pStyle w:val="FirstParagraph"/>
+      </w:pPr>
+      <w:r>
+        <w:rPr>
+          <w:b/>
+          <w:bCs/>
+        </w:rPr>
+        <w:t xml:space="preserve">Error responses</w:t>
+      </w:r>
+      <w:r>
+        <w:t xml:space="preserve">:</w:t>
+      </w:r>
+      <w:r>
+        <w:t xml:space="preserve"> </w:t>
+      </w:r>
+      <w:r>
+        <w:rPr>
+          <w:rStyle w:val="VerbatimChar"/>
+        </w:rPr>
+        <w:t xml:space="preserve">401</w:t>
+      </w:r>
+      <w:r>
+        <w:t xml:space="preserve"> </w:t>
+      </w:r>
+      <w:r>
+        <w:t xml:space="preserve">missing/invalid/expired token, or token has no</w:t>
+      </w:r>
+      <w:r>
+        <w:t xml:space="preserve"> </w:t>
+      </w:r>
+      <w:r>
+        <w:rPr>
+          <w:rStyle w:val="VerbatimChar"/>
+        </w:rPr>
+        <w:t xml:space="preserve">user_id</w:t>
+      </w:r>
+      <w:r>
+        <w:t xml:space="preserve"> </w:t>
+      </w:r>
+      <w:r>
+        <w:t xml:space="preserve">(e.g. a device token was used instead);</w:t>
+      </w:r>
+      <w:r>
+        <w:t xml:space="preserve"> </w:t>
+      </w:r>
+      <w:r>
+        <w:rPr>
+          <w:rStyle w:val="VerbatimChar"/>
+        </w:rPr>
+        <w:t xml:space="preserve">404</w:t>
+      </w:r>
+      <w:r>
+        <w:t xml:space="preserve"> </w:t>
+      </w:r>
+      <w:r>
+        <w:t xml:space="preserve">user not found;</w:t>
+      </w:r>
+      <w:r>
+        <w:t xml:space="preserve"> </w:t>
+      </w:r>
+      <w:r>
+        <w:rPr>
+          <w:rStyle w:val="VerbatimChar"/>
+        </w:rPr>
+        <w:t xml:space="preserve">403</w:t>
+      </w:r>
+      <w:r>
+        <w:t xml:space="preserve"> </w:t>
+      </w:r>
+      <w:r>
+        <w:t xml:space="preserve">caller is neither a global admin nor an estate admin;</w:t>
+      </w:r>
+      <w:r>
+        <w:t xml:space="preserve"> </w:t>
+      </w:r>
+      <w:r>
+        <w:rPr>
+          <w:rStyle w:val="VerbatimChar"/>
+        </w:rPr>
+        <w:t xml:space="preserve">500</w:t>
+      </w:r>
+      <w:r>
+        <w:t xml:space="preserve"> </w:t>
+      </w:r>
+      <w:r>
+        <w:rPr>
+          <w:rStyle w:val="VerbatimChar"/>
+        </w:rPr>
+        <w:t xml:space="preserve">FIHANKRA_FEEDBACK_SECRET</w:t>
+      </w:r>
+      <w:r>
+        <w:t xml:space="preserve"> </w:t>
+      </w:r>
+      <w:r>
+        <w:t xml:space="preserve">not configured.</w:t>
+      </w:r>
+    </w:p>
+    <w:p>
+      <w:pPr>
+        <w:pStyle w:val="BodyText"/>
+      </w:pPr>
+      <w:r>
+        <w:t xml:space="preserve">Re-checks the caller’s admin status fresh from the database (global</w:t>
+      </w:r>
+      <w:r>
+        <w:t xml:space="preserve"> </w:t>
+      </w:r>
+      <w:r>
+        <w:rPr>
+          <w:rStyle w:val="VerbatimChar"/>
+        </w:rPr>
+        <w:t xml:space="preserve">is_admin</w:t>
+      </w:r>
+      <w:r>
+        <w:t xml:space="preserve">, or an</w:t>
+      </w:r>
+      <w:r>
+        <w:t xml:space="preserve"> </w:t>
+      </w:r>
+      <w:r>
+        <w:rPr>
+          <w:rStyle w:val="VerbatimChar"/>
+        </w:rPr>
+        <w:t xml:space="preserve">account_holders</w:t>
+      </w:r>
+      <w:r>
+        <w:t xml:space="preserve"> </w:t>
+      </w:r>
+      <w:r>
+        <w:t xml:space="preserve">row with account type</w:t>
+      </w:r>
+      <w:r>
+        <w:t xml:space="preserve"> </w:t>
+      </w:r>
+      <w:r>
+        <w:rPr>
+          <w:rStyle w:val="VerbatimChar"/>
+        </w:rPr>
+        <w:t xml:space="preserve">ADMIN</w:t>
+      </w:r>
+      <w:r>
+        <w:t xml:space="preserve">) and mints a new fihankra-feedback identity token, without requiring a full re-login. Intended to be called by the frontend shortly before the previously issued</w:t>
+      </w:r>
+      <w:r>
+        <w:t xml:space="preserve"> </w:t>
+      </w:r>
+      <w:r>
+        <w:rPr>
+          <w:rStyle w:val="VerbatimChar"/>
+        </w:rPr>
+        <w:t xml:space="preserve">feedback_token</w:t>
+      </w:r>
+      <w:r>
+        <w:t xml:space="preserve"> </w:t>
+      </w:r>
+      <w:r>
+        <w:t xml:space="preserve">expires (it has a fixed 1-hour lifetime and does not auto-renew), either on a timer while the embedded widget is mounted, or reactively if the widget signals the identity token has gone stale.</w:t>
+      </w:r>
+    </w:p>
+    <w:bookmarkEnd w:id="18"/>
+    <w:bookmarkStart w:id="19" w:name="post-userchange_password"/>
+    <w:p>
+      <w:pPr>
+        <w:pStyle w:val="Heading3"/>
+      </w:pPr>
+      <w:r>
         <w:t xml:space="preserve">POST /user/change_password</w:t>
       </w:r>
     </w:p>
@@ -3257,8 +4252,8 @@
         <w:t xml:space="preserve">Changes the authenticated user’s own password after verifying the old one.</w:t>
       </w:r>
     </w:p>
-    <w:bookmarkEnd w:id="18"/>
-    <w:bookmarkStart w:id="19" w:name="post-userchange_type"/>
+    <w:bookmarkEnd w:id="19"/>
+    <w:bookmarkStart w:id="20" w:name="post-userchange_type"/>
     <w:p>
       <w:pPr>
         <w:pStyle w:val="Heading3"/>
@@ -3518,8 +4513,8 @@
         <w:t xml:space="preserve">row (effectively promotes/demotes global admin status).</w:t>
       </w:r>
     </w:p>
-    <w:bookmarkEnd w:id="19"/>
-    <w:bookmarkStart w:id="20" w:name="post-userdeactivate"/>
+    <w:bookmarkEnd w:id="20"/>
+    <w:bookmarkStart w:id="21" w:name="post-userdeactivate"/>
     <w:p>
       <w:pPr>
         <w:pStyle w:val="Heading3"/>
@@ -3779,8 +4774,8 @@
         <w:t xml:space="preserve">rows.</w:t>
       </w:r>
     </w:p>
-    <w:bookmarkEnd w:id="20"/>
-    <w:bookmarkStart w:id="21" w:name="post-useremailtest"/>
+    <w:bookmarkEnd w:id="21"/>
+    <w:bookmarkStart w:id="22" w:name="post-useremailtest"/>
     <w:p>
       <w:pPr>
         <w:pStyle w:val="Heading3"/>
@@ -3890,8 +4885,8 @@
         <w:t xml:space="preserve">) to the given address; intended for debugging the email integration.</w:t>
       </w:r>
     </w:p>
-    <w:bookmarkEnd w:id="21"/>
-    <w:bookmarkStart w:id="22" w:name="post-useroauth"/>
+    <w:bookmarkEnd w:id="22"/>
+    <w:bookmarkStart w:id="23" w:name="post-useroauth"/>
     <w:p>
       <w:pPr>
         <w:pStyle w:val="Heading3"/>
@@ -4061,8 +5056,8 @@
         <w:t xml:space="preserve">.</w:t>
       </w:r>
     </w:p>
-    <w:bookmarkEnd w:id="22"/>
-    <w:bookmarkStart w:id="23" w:name="post-usersubmit_report"/>
+    <w:bookmarkEnd w:id="23"/>
+    <w:bookmarkStart w:id="24" w:name="post-usersubmit_report"/>
     <w:p>
       <w:pPr>
         <w:pStyle w:val="Heading3"/>
@@ -4268,8 +5263,8 @@
         <w:t xml:space="preserve">) and emails all active admin users a notification.</w:t>
       </w:r>
     </w:p>
-    <w:bookmarkEnd w:id="23"/>
-    <w:bookmarkStart w:id="24" w:name="post-userupdate_report_status"/>
+    <w:bookmarkEnd w:id="24"/>
+    <w:bookmarkStart w:id="25" w:name="post-userupdate_report_status"/>
     <w:p>
       <w:pPr>
         <w:pStyle w:val="Heading3"/>
@@ -4532,8 +5527,8 @@
         <w:t xml:space="preserve">Updates the status of an existing user report.</w:t>
       </w:r>
     </w:p>
-    <w:bookmarkEnd w:id="24"/>
-    <w:bookmarkStart w:id="25" w:name="get-useraccountsme"/>
+    <w:bookmarkEnd w:id="25"/>
+    <w:bookmarkStart w:id="26" w:name="get-useraccountsme"/>
     <w:p>
       <w:pPr>
         <w:pStyle w:val="Heading3"/>
@@ -4829,8 +5824,8 @@
         <w:t xml:space="preserve">Returns the authenticated user’s own account-holder records across estates.</w:t>
       </w:r>
     </w:p>
-    <w:bookmarkEnd w:id="25"/>
-    <w:bookmarkStart w:id="26" w:name="get-useraccountsuser_id"/>
+    <w:bookmarkEnd w:id="26"/>
+    <w:bookmarkStart w:id="27" w:name="get-useraccountsuser_id"/>
     <w:p>
       <w:pPr>
         <w:pStyle w:val="Heading3"/>
@@ -5090,8 +6085,8 @@
         <w:t xml:space="preserve">Returns the account-holder records for a specific user (admin lookup).</w:t>
       </w:r>
     </w:p>
-    <w:bookmarkEnd w:id="26"/>
-    <w:bookmarkStart w:id="27" w:name="get-userall"/>
+    <w:bookmarkEnd w:id="27"/>
+    <w:bookmarkStart w:id="28" w:name="get-userall"/>
     <w:p>
       <w:pPr>
         <w:pStyle w:val="Heading3"/>
@@ -5348,8 +6343,8 @@
         <w:t xml:space="preserve">Lists all users in the system, paginated.</w:t>
       </w:r>
     </w:p>
-    <w:bookmarkEnd w:id="27"/>
-    <w:bookmarkStart w:id="28" w:name="post-useractivate"/>
+    <w:bookmarkEnd w:id="28"/>
+    <w:bookmarkStart w:id="29" w:name="post-useractivate"/>
     <w:p>
       <w:pPr>
         <w:pStyle w:val="Heading3"/>
@@ -5567,8 +6562,8 @@
         <w:t xml:space="preserve">on the target user.</w:t>
       </w:r>
     </w:p>
-    <w:bookmarkEnd w:id="28"/>
-    <w:bookmarkStart w:id="29" w:name="post-userforgot_password"/>
+    <w:bookmarkEnd w:id="29"/>
+    <w:bookmarkStart w:id="30" w:name="post-userforgot_password"/>
     <w:p>
       <w:pPr>
         <w:pStyle w:val="Heading3"/>
@@ -5738,8 +6733,8 @@
         <w:t xml:space="preserve">) needed for the next step.</w:t>
       </w:r>
     </w:p>
-    <w:bookmarkEnd w:id="29"/>
-    <w:bookmarkStart w:id="30" w:name="post-userverify_reset_otp"/>
+    <w:bookmarkEnd w:id="30"/>
+    <w:bookmarkStart w:id="31" w:name="post-userverify_reset_otp"/>
     <w:p>
       <w:pPr>
         <w:pStyle w:val="Heading3"/>
@@ -5945,8 +6940,8 @@
         <w:t xml:space="preserve">row on success.</w:t>
       </w:r>
     </w:p>
-    <w:bookmarkEnd w:id="30"/>
-    <w:bookmarkStart w:id="31" w:name="post-userdelete_user"/>
+    <w:bookmarkEnd w:id="31"/>
+    <w:bookmarkStart w:id="32" w:name="post-userdelete_user"/>
     <w:p>
       <w:pPr>
         <w:pStyle w:val="Heading3"/>
@@ -6164,8 +7159,8 @@
         <w:t xml:space="preserve">row for the target user.</w:t>
       </w:r>
     </w:p>
-    <w:bookmarkEnd w:id="31"/>
-    <w:bookmarkStart w:id="32" w:name="post-userreset_password"/>
+    <w:bookmarkEnd w:id="32"/>
+    <w:bookmarkStart w:id="33" w:name="post-userreset_password"/>
     <w:p>
       <w:pPr>
         <w:pStyle w:val="Heading3"/>
@@ -6428,8 +7423,8 @@
         <w:t xml:space="preserve">Sets a new password for the authenticated user (post-OTP-verification flow).</w:t>
       </w:r>
     </w:p>
-    <w:bookmarkEnd w:id="32"/>
-    <w:bookmarkStart w:id="33" w:name="get-userreports"/>
+    <w:bookmarkEnd w:id="33"/>
+    <w:bookmarkStart w:id="34" w:name="get-userreports"/>
     <w:p>
       <w:pPr>
         <w:pStyle w:val="Heading3"/>
@@ -6689,8 +7684,8 @@
         <w:t xml:space="preserve">Lists all submitted user reports.</w:t>
       </w:r>
     </w:p>
-    <w:bookmarkEnd w:id="33"/>
-    <w:bookmarkStart w:id="34" w:name="get-userreport_statusreport_id"/>
+    <w:bookmarkEnd w:id="34"/>
+    <w:bookmarkStart w:id="35" w:name="get-userreport_statusreport_id"/>
     <w:p>
       <w:pPr>
         <w:pStyle w:val="Heading3"/>
@@ -6992,8 +7987,8 @@
         <w:t xml:space="preserve">.)</w:t>
       </w:r>
     </w:p>
-    <w:bookmarkEnd w:id="34"/>
-    <w:bookmarkStart w:id="35" w:name="get-userreport_status"/>
+    <w:bookmarkEnd w:id="35"/>
+    <w:bookmarkStart w:id="36" w:name="get-userreport_status"/>
     <w:p>
       <w:pPr>
         <w:pStyle w:val="Heading3"/>
@@ -7296,9 +8291,9 @@
         </w:pict>
       </w:r>
     </w:p>
-    <w:bookmarkEnd w:id="35"/>
     <w:bookmarkEnd w:id="36"/>
-    <w:bookmarkStart w:id="55" w:name="account-api"/>
+    <w:bookmarkEnd w:id="37"/>
+    <w:bookmarkStart w:id="56" w:name="account-api"/>
     <w:p>
       <w:pPr>
         <w:pStyle w:val="Heading2"/>
@@ -7456,7 +8451,7 @@
         <w:t xml:space="preserve">) can perform many of these actions, not only global admins.</w:t>
       </w:r>
     </w:p>
-    <w:bookmarkStart w:id="37" w:name="post-accountsignup"/>
+    <w:bookmarkStart w:id="38" w:name="post-accountsignup"/>
     <w:p>
       <w:pPr>
         <w:pStyle w:val="Heading3"/>
@@ -7794,8 +8789,8 @@
         <w:t xml:space="preserve">).</w:t>
       </w:r>
     </w:p>
-    <w:bookmarkEnd w:id="37"/>
-    <w:bookmarkStart w:id="38" w:name="post-accountadmin-signup"/>
+    <w:bookmarkEnd w:id="38"/>
+    <w:bookmarkStart w:id="39" w:name="post-accountadmin-signup"/>
     <w:p>
       <w:pPr>
         <w:pStyle w:val="Heading3"/>
@@ -8109,8 +9104,8 @@
         <w:t xml:space="preserve">immediately.</w:t>
       </w:r>
     </w:p>
-    <w:bookmarkEnd w:id="38"/>
-    <w:bookmarkStart w:id="39" w:name="post-accountchange_type"/>
+    <w:bookmarkEnd w:id="39"/>
+    <w:bookmarkStart w:id="40" w:name="post-accountchange_type"/>
     <w:p>
       <w:pPr>
         <w:pStyle w:val="Heading3"/>
@@ -8388,8 +9383,8 @@
         <w:t xml:space="preserve">row.</w:t>
       </w:r>
     </w:p>
-    <w:bookmarkEnd w:id="39"/>
-    <w:bookmarkStart w:id="40" w:name="post-accountdeactivate"/>
+    <w:bookmarkEnd w:id="40"/>
+    <w:bookmarkStart w:id="41" w:name="post-accountdeactivate"/>
     <w:p>
       <w:pPr>
         <w:pStyle w:val="Heading3"/>
@@ -8625,8 +9620,8 @@
         <w:t xml:space="preserve">row.</w:t>
       </w:r>
     </w:p>
-    <w:bookmarkEnd w:id="40"/>
-    <w:bookmarkStart w:id="41" w:name="post-accountactivate"/>
+    <w:bookmarkEnd w:id="41"/>
+    <w:bookmarkStart w:id="42" w:name="post-accountactivate"/>
     <w:p>
       <w:pPr>
         <w:pStyle w:val="Heading3"/>
@@ -8880,8 +9875,8 @@
         <w:t xml:space="preserve">.</w:t>
       </w:r>
     </w:p>
-    <w:bookmarkEnd w:id="41"/>
-    <w:bookmarkStart w:id="42" w:name="post-accountupdate"/>
+    <w:bookmarkEnd w:id="42"/>
+    <w:bookmarkStart w:id="43" w:name="post-accountupdate"/>
     <w:p>
       <w:pPr>
         <w:pStyle w:val="Heading3"/>
@@ -9138,8 +10133,8 @@
         <w:t xml:space="preserve">row linked to the given account holder (self, or a sub-account owned by the caller, or any account if admin).</w:t>
       </w:r>
     </w:p>
-    <w:bookmarkEnd w:id="42"/>
-    <w:bookmarkStart w:id="43" w:name="post-accountsub_usercreate"/>
+    <w:bookmarkEnd w:id="43"/>
+    <w:bookmarkStart w:id="44" w:name="post-accountsub_usercreate"/>
     <w:p>
       <w:pPr>
         <w:pStyle w:val="Heading3"/>
@@ -9495,8 +10490,8 @@
         <w:t xml:space="preserve">invitation entry (with a 30-minute OTP), then emails the invite to the child’s email address.</w:t>
       </w:r>
     </w:p>
-    <w:bookmarkEnd w:id="43"/>
-    <w:bookmarkStart w:id="44" w:name="post-accountsub_userselect_privilege"/>
+    <w:bookmarkEnd w:id="44"/>
+    <w:bookmarkStart w:id="45" w:name="post-accountsub_userselect_privilege"/>
     <w:p>
       <w:pPr>
         <w:pStyle w:val="Heading3"/>
@@ -9897,8 +10892,8 @@
         <w:t xml:space="preserve">.</w:t>
       </w:r>
     </w:p>
-    <w:bookmarkEnd w:id="44"/>
-    <w:bookmarkStart w:id="45" w:name="post-accountsub_usercreate_privilege"/>
+    <w:bookmarkEnd w:id="45"/>
+    <w:bookmarkStart w:id="46" w:name="post-accountsub_usercreate_privilege"/>
     <w:p>
       <w:pPr>
         <w:pStyle w:val="Heading3"/>
@@ -10167,8 +11162,8 @@
         <w:t xml:space="preserve">(idempotent insert).</w:t>
       </w:r>
     </w:p>
-    <w:bookmarkEnd w:id="45"/>
-    <w:bookmarkStart w:id="46" w:name="post-accountsub_userverify"/>
+    <w:bookmarkEnd w:id="46"/>
+    <w:bookmarkStart w:id="47" w:name="post-accountsub_userverify"/>
     <w:p>
       <w:pPr>
         <w:pStyle w:val="Heading3"/>
@@ -10404,8 +11399,8 @@
         <w:t xml:space="preserve">row for the (now-authenticated) invited user, and deletes the pending record.</w:t>
       </w:r>
     </w:p>
-    <w:bookmarkEnd w:id="46"/>
-    <w:bookmarkStart w:id="47" w:name="post-accountsub_userotp"/>
+    <w:bookmarkEnd w:id="47"/>
+    <w:bookmarkStart w:id="48" w:name="post-accountsub_userotp"/>
     <w:p>
       <w:pPr>
         <w:pStyle w:val="Heading3"/>
@@ -10554,8 +11549,8 @@
         <w:t xml:space="preserve">Regenerates the OTP (30-minute expiry) for a pending sub-account invitation and emails it.</w:t>
       </w:r>
     </w:p>
-    <w:bookmarkEnd w:id="47"/>
-    <w:bookmarkStart w:id="48" w:name="post-accountsub_userupdate_priv"/>
+    <w:bookmarkEnd w:id="48"/>
+    <w:bookmarkStart w:id="49" w:name="post-accountsub_userupdate_priv"/>
     <w:p>
       <w:pPr>
         <w:pStyle w:val="Heading3"/>
@@ -10818,8 +11813,8 @@
         <w:t xml:space="preserve">record (existing links are left untouched — this is additive, not a full replace).</w:t>
       </w:r>
     </w:p>
-    <w:bookmarkEnd w:id="48"/>
-    <w:bookmarkStart w:id="49" w:name="post-accountotpgenerate"/>
+    <w:bookmarkEnd w:id="49"/>
+    <w:bookmarkStart w:id="50" w:name="post-accountotpgenerate"/>
     <w:p>
       <w:pPr>
         <w:pStyle w:val="Heading3"/>
@@ -11040,8 +12035,8 @@
         <w:t xml:space="preserve">row.</w:t>
       </w:r>
     </w:p>
-    <w:bookmarkEnd w:id="49"/>
-    <w:bookmarkStart w:id="50" w:name="post-accountotpverify"/>
+    <w:bookmarkEnd w:id="50"/>
+    <w:bookmarkStart w:id="51" w:name="post-accountotpverify"/>
     <w:p>
       <w:pPr>
         <w:pStyle w:val="Heading3"/>
@@ -11229,8 +12224,8 @@
         <w:t xml:space="preserve">Validates a gate-entry OTP against the estate of the gate identified in the token, and clears it after a successful match.</w:t>
       </w:r>
     </w:p>
-    <w:bookmarkEnd w:id="50"/>
-    <w:bookmarkStart w:id="51" w:name="delete-accountdelete"/>
+    <w:bookmarkEnd w:id="51"/>
+    <w:bookmarkStart w:id="52" w:name="delete-accountdelete"/>
     <w:p>
       <w:pPr>
         <w:pStyle w:val="Heading3"/>
@@ -11466,8 +12461,8 @@
         <w:t xml:space="preserve">row) for the given account holder.</w:t>
       </w:r>
     </w:p>
-    <w:bookmarkEnd w:id="51"/>
-    <w:bookmarkStart w:id="52" w:name="delete-accountsub_userdelete"/>
+    <w:bookmarkEnd w:id="52"/>
+    <w:bookmarkStart w:id="53" w:name="delete-accountsub_userdelete"/>
     <w:p>
       <w:pPr>
         <w:pStyle w:val="Heading3"/>
@@ -11739,8 +12734,8 @@
         <w:t xml:space="preserve">rows.</w:t>
       </w:r>
     </w:p>
-    <w:bookmarkEnd w:id="52"/>
-    <w:bookmarkStart w:id="53" w:name="get-accountestateestate_id"/>
+    <w:bookmarkEnd w:id="53"/>
+    <w:bookmarkStart w:id="54" w:name="get-accountestateestate_id"/>
     <w:p>
       <w:pPr>
         <w:pStyle w:val="Heading3"/>
@@ -12141,8 +13136,8 @@
         <w:t xml:space="preserve">Lists all account holders in a given estate (admin/estate-manager view).</w:t>
       </w:r>
     </w:p>
-    <w:bookmarkEnd w:id="53"/>
-    <w:bookmarkStart w:id="54" w:name="X044f92a6012db920e11929831d21c4e75470662"/>
+    <w:bookmarkEnd w:id="54"/>
+    <w:bookmarkStart w:id="55" w:name="X044f92a6012db920e11929831d21c4e75470662"/>
     <w:p>
       <w:pPr>
         <w:pStyle w:val="Heading3"/>
@@ -12592,9 +13587,9 @@
         </w:pict>
       </w:r>
     </w:p>
-    <w:bookmarkEnd w:id="54"/>
     <w:bookmarkEnd w:id="55"/>
-    <w:bookmarkStart w:id="61" w:name="estate-api"/>
+    <w:bookmarkEnd w:id="56"/>
+    <w:bookmarkStart w:id="62" w:name="estate-api"/>
     <w:p>
       <w:pPr>
         <w:pStyle w:val="Heading2"/>
@@ -12644,7 +13639,7 @@
         <w:t xml:space="preserve">).</w:t>
       </w:r>
     </w:p>
-    <w:bookmarkStart w:id="56" w:name="post-estatecreate"/>
+    <w:bookmarkStart w:id="57" w:name="post-estatecreate"/>
     <w:p>
       <w:pPr>
         <w:pStyle w:val="Heading3"/>
@@ -12886,8 +13881,8 @@
         <w:t xml:space="preserve">access group for the new estate.</w:t>
       </w:r>
     </w:p>
-    <w:bookmarkEnd w:id="56"/>
-    <w:bookmarkStart w:id="57" w:name="post-estateupdate"/>
+    <w:bookmarkEnd w:id="57"/>
+    <w:bookmarkStart w:id="58" w:name="post-estateupdate"/>
     <w:p>
       <w:pPr>
         <w:pStyle w:val="Heading3"/>
@@ -13198,8 +14193,8 @@
         <w:t xml:space="preserve">).</w:t>
       </w:r>
     </w:p>
-    <w:bookmarkEnd w:id="57"/>
-    <w:bookmarkStart w:id="58" w:name="delete-estatedelete"/>
+    <w:bookmarkEnd w:id="58"/>
+    <w:bookmarkStart w:id="59" w:name="delete-estatedelete"/>
     <w:p>
       <w:pPr>
         <w:pStyle w:val="Heading3"/>
@@ -13417,8 +14412,8 @@
         <w:t xml:space="preserve">row.</w:t>
       </w:r>
     </w:p>
-    <w:bookmarkEnd w:id="58"/>
-    <w:bookmarkStart w:id="59" w:name="get-estateall"/>
+    <w:bookmarkEnd w:id="59"/>
+    <w:bookmarkStart w:id="60" w:name="get-estateall"/>
     <w:p>
       <w:pPr>
         <w:pStyle w:val="Heading3"/>
@@ -13642,8 +14637,8 @@
         <w:t xml:space="preserve">Lists all estates in the system, paginated.</w:t>
       </w:r>
     </w:p>
-    <w:bookmarkEnd w:id="59"/>
-    <w:bookmarkStart w:id="60" w:name="get-estateid"/>
+    <w:bookmarkEnd w:id="60"/>
+    <w:bookmarkStart w:id="61" w:name="get-estateid"/>
     <w:p>
       <w:pPr>
         <w:pStyle w:val="Heading3"/>
@@ -14160,9 +15155,9 @@
         </w:pict>
       </w:r>
     </w:p>
-    <w:bookmarkEnd w:id="60"/>
     <w:bookmarkEnd w:id="61"/>
-    <w:bookmarkStart w:id="84" w:name="gate-api"/>
+    <w:bookmarkEnd w:id="62"/>
+    <w:bookmarkStart w:id="85" w:name="gate-api"/>
     <w:p>
       <w:pPr>
         <w:pStyle w:val="Heading2"/>
@@ -14233,7 +15228,7 @@
         <w:t xml:space="preserve">).</w:t>
       </w:r>
     </w:p>
-    <w:bookmarkStart w:id="62" w:name="post-gatecreate"/>
+    <w:bookmarkStart w:id="63" w:name="post-gatecreate"/>
     <w:p>
       <w:pPr>
         <w:pStyle w:val="Heading3"/>
@@ -14580,8 +15575,8 @@
         <w:t xml:space="preserve">log entry.</w:t>
       </w:r>
     </w:p>
-    <w:bookmarkEnd w:id="62"/>
-    <w:bookmarkStart w:id="63" w:name="post-gateupdate"/>
+    <w:bookmarkEnd w:id="63"/>
+    <w:bookmarkStart w:id="64" w:name="post-gateupdate"/>
     <w:p>
       <w:pPr>
         <w:pStyle w:val="Heading3"/>
@@ -14891,8 +15886,8 @@
         <w:t xml:space="preserve">.</w:t>
       </w:r>
     </w:p>
-    <w:bookmarkEnd w:id="63"/>
-    <w:bookmarkStart w:id="64" w:name="post-gateheartbeat"/>
+    <w:bookmarkEnd w:id="64"/>
+    <w:bookmarkStart w:id="65" w:name="post-gateheartbeat"/>
     <w:p>
       <w:pPr>
         <w:pStyle w:val="Heading3"/>
@@ -15212,8 +16207,8 @@
         <w:t xml:space="preserve">.</w:t>
       </w:r>
     </w:p>
-    <w:bookmarkEnd w:id="64"/>
-    <w:bookmarkStart w:id="65" w:name="post-gateactivate"/>
+    <w:bookmarkEnd w:id="65"/>
+    <w:bookmarkStart w:id="66" w:name="post-gateactivate"/>
     <w:p>
       <w:pPr>
         <w:pStyle w:val="Heading3"/>
@@ -15455,8 +16450,8 @@
         <w:t xml:space="preserve">.</w:t>
       </w:r>
     </w:p>
-    <w:bookmarkEnd w:id="65"/>
-    <w:bookmarkStart w:id="66" w:name="post-gatedeactivate"/>
+    <w:bookmarkEnd w:id="66"/>
+    <w:bookmarkStart w:id="67" w:name="post-gatedeactivate"/>
     <w:p>
       <w:pPr>
         <w:pStyle w:val="Heading3"/>
@@ -15683,8 +16678,8 @@
         <w:t xml:space="preserve">.</w:t>
       </w:r>
     </w:p>
-    <w:bookmarkEnd w:id="66"/>
-    <w:bookmarkStart w:id="67" w:name="post-gatevehicle_arrivalcallback"/>
+    <w:bookmarkEnd w:id="67"/>
+    <w:bookmarkStart w:id="68" w:name="post-gatevehicle_arrivalcallback"/>
     <w:p>
       <w:pPr>
         <w:pStyle w:val="Heading3"/>
@@ -16372,8 +17367,8 @@
         <w:t xml:space="preserve">.</w:t>
       </w:r>
     </w:p>
-    <w:bookmarkEnd w:id="67"/>
-    <w:bookmarkStart w:id="68" w:name="post-gateemail_user"/>
+    <w:bookmarkEnd w:id="68"/>
+    <w:bookmarkStart w:id="69" w:name="post-gateemail_user"/>
     <w:p>
       <w:pPr>
         <w:pStyle w:val="Heading3"/>
@@ -16630,8 +17625,8 @@
         <w:t xml:space="preserve">. Per-recipient send failures are caught and skipped, not surfaced as an overall error.</w:t>
       </w:r>
     </w:p>
-    <w:bookmarkEnd w:id="68"/>
-    <w:bookmarkStart w:id="69" w:name="delete-gatedelete"/>
+    <w:bookmarkEnd w:id="69"/>
+    <w:bookmarkStart w:id="70" w:name="delete-gatedelete"/>
     <w:p>
       <w:pPr>
         <w:pStyle w:val="Heading3"/>
@@ -16846,8 +17841,8 @@
         <w:t xml:space="preserve">.</w:t>
       </w:r>
     </w:p>
-    <w:bookmarkEnd w:id="69"/>
-    <w:bookmarkStart w:id="70" w:name="get-gateall"/>
+    <w:bookmarkEnd w:id="70"/>
+    <w:bookmarkStart w:id="71" w:name="get-gateall"/>
     <w:p>
       <w:pPr>
         <w:pStyle w:val="Heading3"/>
@@ -17385,8 +18380,8 @@
         <w:t xml:space="preserve">Lists all gates across all estates, paginated, ordered by newest first.</w:t>
       </w:r>
     </w:p>
-    <w:bookmarkEnd w:id="70"/>
-    <w:bookmarkStart w:id="71" w:name="get-gateestateestate_id"/>
+    <w:bookmarkEnd w:id="71"/>
+    <w:bookmarkStart w:id="72" w:name="get-gateestateestate_id"/>
     <w:p>
       <w:pPr>
         <w:pStyle w:val="Heading3"/>
@@ -17617,8 +18612,8 @@
         <w:t xml:space="preserve">Lists gates belonging to a specific estate, paginated.</w:t>
       </w:r>
     </w:p>
-    <w:bookmarkEnd w:id="71"/>
-    <w:bookmarkStart w:id="72" w:name="get-gateid"/>
+    <w:bookmarkEnd w:id="72"/>
+    <w:bookmarkStart w:id="73" w:name="get-gateid"/>
     <w:p>
       <w:pPr>
         <w:pStyle w:val="Heading3"/>
@@ -17818,8 +18813,8 @@
         <w:t xml:space="preserve">Fetches a single gate by ID.</w:t>
       </w:r>
     </w:p>
-    <w:bookmarkEnd w:id="72"/>
-    <w:bookmarkStart w:id="73" w:name="get-gatecontrollervehicles"/>
+    <w:bookmarkEnd w:id="73"/>
+    <w:bookmarkStart w:id="74" w:name="get-gatecontrollervehicles"/>
     <w:p>
       <w:pPr>
         <w:pStyle w:val="Heading3"/>
@@ -17983,8 +18978,8 @@
         <w:t xml:space="preserve">Returns all vehicles allowed through the gate’s linked access groups, ignoring time-window restrictions. Intended for gate-controller hardware polling.</w:t>
       </w:r>
     </w:p>
-    <w:bookmarkEnd w:id="73"/>
-    <w:bookmarkStart w:id="74" w:name="get-gatecontrollertimed_vehicles"/>
+    <w:bookmarkEnd w:id="74"/>
+    <w:bookmarkStart w:id="75" w:name="get-gatecontrollertimed_vehicles"/>
     <w:p>
       <w:pPr>
         <w:pStyle w:val="Heading3"/>
@@ -18166,8 +19161,8 @@
         <w:t xml:space="preserve">.</w:t>
       </w:r>
     </w:p>
-    <w:bookmarkEnd w:id="74"/>
-    <w:bookmarkStart w:id="75" w:name="get-gatevehiclesgate_id"/>
+    <w:bookmarkEnd w:id="75"/>
+    <w:bookmarkStart w:id="76" w:name="get-gatevehiclesgate_id"/>
     <w:p>
       <w:pPr>
         <w:pStyle w:val="Heading3"/>
@@ -18364,8 +19359,8 @@
         <w:t xml:space="preserve">(no time check) but for authenticated app users/admins rather than controllers.</w:t>
       </w:r>
     </w:p>
-    <w:bookmarkEnd w:id="75"/>
-    <w:bookmarkStart w:id="76" w:name="get-gatetimed_vehiclesgate_id"/>
+    <w:bookmarkEnd w:id="76"/>
+    <w:bookmarkStart w:id="77" w:name="get-gatetimed_vehiclesgate_id"/>
     <w:p>
       <w:pPr>
         <w:pStyle w:val="Heading3"/>
@@ -18766,8 +19761,8 @@
         <w:t xml:space="preserve">Paginated version of the timed vehicle-access lookup, for authenticated users.</w:t>
       </w:r>
     </w:p>
-    <w:bookmarkEnd w:id="76"/>
-    <w:bookmarkStart w:id="77" w:name="post-systemmetrics"/>
+    <w:bookmarkEnd w:id="77"/>
+    <w:bookmarkStart w:id="78" w:name="post-systemmetrics"/>
     <w:p>
       <w:pPr>
         <w:pStyle w:val="Heading3"/>
@@ -19198,8 +20193,8 @@
         <w:t xml:space="preserve">(temperature, camera counts, storage, running services, offline cameras) and keeps an in-memory copy for the current invocation.</w:t>
       </w:r>
     </w:p>
-    <w:bookmarkEnd w:id="77"/>
-    <w:bookmarkStart w:id="78" w:name="get-systemlatest_metrics"/>
+    <w:bookmarkEnd w:id="78"/>
+    <w:bookmarkStart w:id="79" w:name="get-systemlatest_metrics"/>
     <w:p>
       <w:pPr>
         <w:pStyle w:val="Heading3"/>
@@ -19623,8 +20618,8 @@
         <w:t xml:space="preserve">row for a gate.</w:t>
       </w:r>
     </w:p>
-    <w:bookmarkEnd w:id="78"/>
-    <w:bookmarkStart w:id="79" w:name="get-systemtemperature"/>
+    <w:bookmarkEnd w:id="79"/>
+    <w:bookmarkStart w:id="80" w:name="get-systemtemperature"/>
     <w:p>
       <w:pPr>
         <w:pStyle w:val="Heading3"/>
@@ -19869,8 +20864,8 @@
         <w:t xml:space="preserve">for charting.</w:t>
       </w:r>
     </w:p>
-    <w:bookmarkEnd w:id="79"/>
-    <w:bookmarkStart w:id="80" w:name="get-camerasdowntime"/>
+    <w:bookmarkEnd w:id="80"/>
+    <w:bookmarkStart w:id="81" w:name="get-camerasdowntime"/>
     <w:p>
       <w:pPr>
         <w:pStyle w:val="Heading3"/>
@@ -20064,8 +21059,8 @@
         <w:t xml:space="preserve">values recorded per metrics sample within the time window for a gate (the code contains a larger commented-out implementation that would compute actual downtime intervals; the live version just echoes each sample’s offline-camera data with its timestamp).</w:t>
       </w:r>
     </w:p>
-    <w:bookmarkEnd w:id="80"/>
-    <w:bookmarkStart w:id="81" w:name="get-systemstorage"/>
+    <w:bookmarkEnd w:id="81"/>
+    <w:bookmarkStart w:id="82" w:name="get-systemstorage"/>
     <w:p>
       <w:pPr>
         <w:pStyle w:val="Heading3"/>
@@ -20304,8 +21299,8 @@
         <w:t xml:space="preserve">, bucketed/averaged by granularity.</w:t>
       </w:r>
     </w:p>
-    <w:bookmarkEnd w:id="81"/>
-    <w:bookmarkStart w:id="82" w:name="get-systemaccess"/>
+    <w:bookmarkEnd w:id="82"/>
+    <w:bookmarkStart w:id="83" w:name="get-systemaccess"/>
     <w:p>
       <w:pPr>
         <w:pStyle w:val="Heading3"/>
@@ -20822,8 +21817,8 @@
         <w:t xml:space="preserve">entries (entries/exits) for a gate within a time window, grouped by license plate and event type, plus overall entry/exit totals.</w:t>
       </w:r>
     </w:p>
-    <w:bookmarkEnd w:id="82"/>
-    <w:bookmarkStart w:id="83" w:name="get-systemvideos"/>
+    <w:bookmarkEnd w:id="83"/>
+    <w:bookmarkStart w:id="84" w:name="get-systemvideos"/>
     <w:p>
       <w:pPr>
         <w:pStyle w:val="Heading3"/>
@@ -21521,9 +22516,9 @@
         </w:pict>
       </w:r>
     </w:p>
-    <w:bookmarkEnd w:id="83"/>
     <w:bookmarkEnd w:id="84"/>
-    <w:bookmarkStart w:id="91" w:name="access-group-api"/>
+    <w:bookmarkEnd w:id="85"/>
+    <w:bookmarkStart w:id="92" w:name="access-group-api"/>
     <w:p>
       <w:pPr>
         <w:pStyle w:val="Heading2"/>
@@ -21579,7 +22574,7 @@
         <w:t xml:space="preserve">).</w:t>
       </w:r>
     </w:p>
-    <w:bookmarkStart w:id="85" w:name="post-access_groupcreate"/>
+    <w:bookmarkStart w:id="86" w:name="post-access_groupcreate"/>
     <w:p>
       <w:pPr>
         <w:pStyle w:val="Heading3"/>
@@ -21866,8 +22861,8 @@
         <w:t xml:space="preserve">.</w:t>
       </w:r>
     </w:p>
-    <w:bookmarkEnd w:id="85"/>
-    <w:bookmarkStart w:id="86" w:name="post-access_groupupdate"/>
+    <w:bookmarkEnd w:id="86"/>
+    <w:bookmarkStart w:id="87" w:name="post-access_groupupdate"/>
     <w:p>
       <w:pPr>
         <w:pStyle w:val="Heading3"/>
@@ -22121,8 +23116,8 @@
         <w:t xml:space="preserve">.</w:t>
       </w:r>
     </w:p>
-    <w:bookmarkEnd w:id="86"/>
-    <w:bookmarkStart w:id="87" w:name="delete-access_groupdelete"/>
+    <w:bookmarkEnd w:id="87"/>
+    <w:bookmarkStart w:id="88" w:name="delete-access_groupdelete"/>
     <w:p>
       <w:pPr>
         <w:pStyle w:val="Heading3"/>
@@ -22337,8 +23332,8 @@
         <w:t xml:space="preserve">.</w:t>
       </w:r>
     </w:p>
-    <w:bookmarkEnd w:id="87"/>
-    <w:bookmarkStart w:id="88" w:name="get-access_groupall"/>
+    <w:bookmarkEnd w:id="88"/>
+    <w:bookmarkStart w:id="89" w:name="get-access_groupall"/>
     <w:p>
       <w:pPr>
         <w:pStyle w:val="Heading3"/>
@@ -22804,8 +23799,8 @@
         <w:t xml:space="preserve">Lists all access groups across all estates.</w:t>
       </w:r>
     </w:p>
-    <w:bookmarkEnd w:id="88"/>
-    <w:bookmarkStart w:id="89" w:name="get-access_groupestateid"/>
+    <w:bookmarkEnd w:id="89"/>
+    <w:bookmarkStart w:id="90" w:name="get-access_groupestateid"/>
     <w:p>
       <w:pPr>
         <w:pStyle w:val="Heading3"/>
@@ -23036,8 +24031,8 @@
         <w:t xml:space="preserve">Lists access groups belonging to one estate.</w:t>
       </w:r>
     </w:p>
-    <w:bookmarkEnd w:id="89"/>
-    <w:bookmarkStart w:id="90" w:name="get-access_groupid"/>
+    <w:bookmarkEnd w:id="90"/>
+    <w:bookmarkStart w:id="91" w:name="get-access_groupid"/>
     <w:p>
       <w:pPr>
         <w:pStyle w:val="Heading3"/>
@@ -23262,9 +24257,9 @@
         </w:pict>
       </w:r>
     </w:p>
-    <w:bookmarkEnd w:id="90"/>
     <w:bookmarkEnd w:id="91"/>
-    <w:bookmarkStart w:id="97" w:name="account-type-api"/>
+    <w:bookmarkEnd w:id="92"/>
+    <w:bookmarkStart w:id="98" w:name="account-type-api"/>
     <w:p>
       <w:pPr>
         <w:pStyle w:val="Heading2"/>
@@ -23320,7 +24315,7 @@
         <w:t xml:space="preserve">). All mutating endpoints are global-admin-only; there is no estate scoping for account types.</w:t>
       </w:r>
     </w:p>
-    <w:bookmarkStart w:id="92" w:name="post-account_typecreate"/>
+    <w:bookmarkStart w:id="93" w:name="post-account_typecreate"/>
     <w:p>
       <w:pPr>
         <w:pStyle w:val="Heading3"/>
@@ -23523,8 +24518,8 @@
         <w:t xml:space="preserve">.</w:t>
       </w:r>
     </w:p>
-    <w:bookmarkEnd w:id="92"/>
-    <w:bookmarkStart w:id="93" w:name="post-account_typeupdate"/>
+    <w:bookmarkEnd w:id="93"/>
+    <w:bookmarkStart w:id="94" w:name="post-account_typeupdate"/>
     <w:p>
       <w:pPr>
         <w:pStyle w:val="Heading3"/>
@@ -23802,8 +24797,8 @@
         <w:t xml:space="preserve">.</w:t>
       </w:r>
     </w:p>
-    <w:bookmarkEnd w:id="93"/>
-    <w:bookmarkStart w:id="94" w:name="delete-account_typedelete"/>
+    <w:bookmarkEnd w:id="94"/>
+    <w:bookmarkStart w:id="95" w:name="delete-account_typedelete"/>
     <w:p>
       <w:pPr>
         <w:pStyle w:val="Heading3"/>
@@ -24039,8 +25034,8 @@
         <w:t xml:space="preserve">, which appears to be a copy/paste bug in the code).</w:t>
       </w:r>
     </w:p>
-    <w:bookmarkEnd w:id="94"/>
-    <w:bookmarkStart w:id="95" w:name="get-account_typeall"/>
+    <w:bookmarkEnd w:id="95"/>
+    <w:bookmarkStart w:id="96" w:name="get-account_typeall"/>
     <w:p>
       <w:pPr>
         <w:pStyle w:val="Heading3"/>
@@ -24455,8 +25450,8 @@
         <w:t xml:space="preserve">Lists all account types, paginated.</w:t>
       </w:r>
     </w:p>
-    <w:bookmarkEnd w:id="95"/>
-    <w:bookmarkStart w:id="96" w:name="get-account_typeid"/>
+    <w:bookmarkEnd w:id="96"/>
+    <w:bookmarkStart w:id="97" w:name="get-account_typeid"/>
     <w:p>
       <w:pPr>
         <w:pStyle w:val="Heading3"/>
@@ -24621,9 +25616,9 @@
         </w:pict>
       </w:r>
     </w:p>
-    <w:bookmarkEnd w:id="96"/>
     <w:bookmarkEnd w:id="97"/>
-    <w:bookmarkStart w:id="103" w:name="privilege-api"/>
+    <w:bookmarkEnd w:id="98"/>
+    <w:bookmarkStart w:id="104" w:name="privilege-api"/>
     <w:p>
       <w:pPr>
         <w:pStyle w:val="Heading2"/>
@@ -24700,7 +25695,7 @@
         <w:t xml:space="preserve">). Every endpoint in this module is global-admin-only.</w:t>
       </w:r>
     </w:p>
-    <w:bookmarkStart w:id="98" w:name="post-privilegecreate"/>
+    <w:bookmarkStart w:id="99" w:name="post-privilegecreate"/>
     <w:p>
       <w:pPr>
         <w:pStyle w:val="Heading3"/>
@@ -24903,8 +25898,8 @@
         <w:t xml:space="preserve">.</w:t>
       </w:r>
     </w:p>
-    <w:bookmarkEnd w:id="98"/>
-    <w:bookmarkStart w:id="99" w:name="post-privilegeupdate"/>
+    <w:bookmarkEnd w:id="99"/>
+    <w:bookmarkStart w:id="100" w:name="post-privilegeupdate"/>
     <w:p>
       <w:pPr>
         <w:pStyle w:val="Heading3"/>
@@ -25185,8 +26180,8 @@
         <w:t xml:space="preserve">(sic — typo in the log type string in the source).</w:t>
       </w:r>
     </w:p>
-    <w:bookmarkEnd w:id="99"/>
-    <w:bookmarkStart w:id="100" w:name="delete-privilegedelete"/>
+    <w:bookmarkEnd w:id="100"/>
+    <w:bookmarkStart w:id="101" w:name="delete-privilegedelete"/>
     <w:p>
       <w:pPr>
         <w:pStyle w:val="Heading3"/>
@@ -25410,8 +26405,8 @@
         <w:t xml:space="preserve">.</w:t>
       </w:r>
     </w:p>
-    <w:bookmarkEnd w:id="100"/>
-    <w:bookmarkStart w:id="101" w:name="get-privilegeall"/>
+    <w:bookmarkEnd w:id="101"/>
+    <w:bookmarkStart w:id="102" w:name="get-privilegeall"/>
     <w:p>
       <w:pPr>
         <w:pStyle w:val="Heading3"/>
@@ -25877,8 +26872,8 @@
         <w:t xml:space="preserve">Lists all privileges, paginated.</w:t>
       </w:r>
     </w:p>
-    <w:bookmarkEnd w:id="101"/>
-    <w:bookmarkStart w:id="102" w:name="get-privilegeid"/>
+    <w:bookmarkEnd w:id="102"/>
+    <w:bookmarkStart w:id="103" w:name="get-privilegeid"/>
     <w:p>
       <w:pPr>
         <w:pStyle w:val="Heading3"/>
@@ -26291,9 +27286,9 @@
         </w:pict>
       </w:r>
     </w:p>
-    <w:bookmarkEnd w:id="102"/>
     <w:bookmarkEnd w:id="103"/>
-    <w:bookmarkStart w:id="113" w:name="guest-api"/>
+    <w:bookmarkEnd w:id="104"/>
+    <w:bookmarkStart w:id="114" w:name="guest-api"/>
     <w:p>
       <w:pPr>
         <w:pStyle w:val="Heading2"/>
@@ -26352,7 +27347,7 @@
         <w:t xml:space="preserve">. Guests are visitors registered under an account holder; a guest optionally has a vehicle, and gets either a car-lane invite or a 6-digit OTP for pedestrian entry.</w:t>
       </w:r>
     </w:p>
-    <w:bookmarkStart w:id="104" w:name="post-guestcreate"/>
+    <w:bookmarkStart w:id="105" w:name="post-guestcreate"/>
     <w:p>
       <w:pPr>
         <w:pStyle w:val="Heading3"/>
@@ -26943,8 +27938,8 @@
         <w:t xml:space="preserve">on unexpected DB/other errors.</w:t>
       </w:r>
     </w:p>
-    <w:bookmarkEnd w:id="104"/>
-    <w:bookmarkStart w:id="105" w:name="post-guestcreate_associate"/>
+    <w:bookmarkEnd w:id="105"/>
+    <w:bookmarkStart w:id="106" w:name="post-guestcreate_associate"/>
     <w:p>
       <w:pPr>
         <w:pStyle w:val="Heading3"/>
@@ -27202,8 +28197,8 @@
         <w:t xml:space="preserve">also validated as required.</w:t>
       </w:r>
     </w:p>
-    <w:bookmarkEnd w:id="105"/>
-    <w:bookmarkStart w:id="106" w:name="post-guestupdate"/>
+    <w:bookmarkEnd w:id="106"/>
+    <w:bookmarkStart w:id="107" w:name="post-guestupdate"/>
     <w:p>
       <w:pPr>
         <w:pStyle w:val="Heading3"/>
@@ -27716,8 +28711,8 @@
         <w:t xml:space="preserve">on unexpected errors.</w:t>
       </w:r>
     </w:p>
-    <w:bookmarkEnd w:id="106"/>
-    <w:bookmarkStart w:id="107" w:name="post-guestverify_otp"/>
+    <w:bookmarkEnd w:id="107"/>
+    <w:bookmarkStart w:id="108" w:name="post-guestverify_otp"/>
     <w:p>
       <w:pPr>
         <w:pStyle w:val="Heading3"/>
@@ -28018,8 +29013,8 @@
         <w:t xml:space="preserve">OTP outside its valid time window.</w:t>
       </w:r>
     </w:p>
-    <w:bookmarkEnd w:id="107"/>
-    <w:bookmarkStart w:id="108" w:name="post-guestsend_otp"/>
+    <w:bookmarkEnd w:id="108"/>
+    <w:bookmarkStart w:id="109" w:name="post-guestsend_otp"/>
     <w:p>
       <w:pPr>
         <w:pStyle w:val="Heading3"/>
@@ -28313,8 +29308,8 @@
         <w:t xml:space="preserve">if the OTP update fails.</w:t>
       </w:r>
     </w:p>
-    <w:bookmarkEnd w:id="108"/>
-    <w:bookmarkStart w:id="109" w:name="delete-guestdelete"/>
+    <w:bookmarkEnd w:id="109"/>
+    <w:bookmarkStart w:id="110" w:name="delete-guestdelete"/>
     <w:p>
       <w:pPr>
         <w:pStyle w:val="Heading3"/>
@@ -28548,8 +29543,8 @@
         <w:t xml:space="preserve">insufficient privileges.</w:t>
       </w:r>
     </w:p>
-    <w:bookmarkEnd w:id="109"/>
-    <w:bookmarkStart w:id="110" w:name="get-guestaccount_holderaccount_holder_id"/>
+    <w:bookmarkEnd w:id="110"/>
+    <w:bookmarkStart w:id="111" w:name="get-guestaccount_holderaccount_holder_id"/>
     <w:p>
       <w:pPr>
         <w:pStyle w:val="Heading3"/>
@@ -28831,8 +29826,8 @@
         <w:t xml:space="preserve">insufficient privileges.</w:t>
       </w:r>
     </w:p>
-    <w:bookmarkEnd w:id="110"/>
-    <w:bookmarkStart w:id="111" w:name="get-guestestateestate_id"/>
+    <w:bookmarkEnd w:id="111"/>
+    <w:bookmarkStart w:id="112" w:name="get-guestestateestate_id"/>
     <w:p>
       <w:pPr>
         <w:pStyle w:val="Heading3"/>
@@ -29117,8 +30112,8 @@
         <w:t xml:space="preserve">insufficient privileges.</w:t>
       </w:r>
     </w:p>
-    <w:bookmarkEnd w:id="111"/>
-    <w:bookmarkStart w:id="112" w:name="get-guestguest_id"/>
+    <w:bookmarkEnd w:id="112"/>
+    <w:bookmarkStart w:id="113" w:name="get-guestguest_id"/>
     <w:p>
       <w:pPr>
         <w:pStyle w:val="Heading3"/>
@@ -29359,9 +30354,9 @@
         </w:pict>
       </w:r>
     </w:p>
-    <w:bookmarkEnd w:id="112"/>
     <w:bookmarkEnd w:id="113"/>
-    <w:bookmarkStart w:id="119" w:name="vehicle-api"/>
+    <w:bookmarkEnd w:id="114"/>
+    <w:bookmarkStart w:id="120" w:name="vehicle-api"/>
     <w:p>
       <w:pPr>
         <w:pStyle w:val="Heading2"/>
@@ -29435,7 +30430,7 @@
         <w:t xml:space="preserve">record (an account holder or a guest); license plates must be unique per estate.</w:t>
       </w:r>
     </w:p>
-    <w:bookmarkStart w:id="114" w:name="post-vehiclecreate"/>
+    <w:bookmarkStart w:id="115" w:name="post-vehiclecreate"/>
     <w:p>
       <w:pPr>
         <w:pStyle w:val="Heading3"/>
@@ -29753,8 +30748,8 @@
         <w:t xml:space="preserve">license plate already registered at this estate.</w:t>
       </w:r>
     </w:p>
-    <w:bookmarkEnd w:id="114"/>
-    <w:bookmarkStart w:id="115" w:name="post-vehicleupdate"/>
+    <w:bookmarkEnd w:id="115"/>
+    <w:bookmarkStart w:id="116" w:name="post-vehicleupdate"/>
     <w:p>
       <w:pPr>
         <w:pStyle w:val="Heading3"/>
@@ -30087,8 +31082,8 @@
         <w:t xml:space="preserve">if the update fails to affect a row.</w:t>
       </w:r>
     </w:p>
-    <w:bookmarkEnd w:id="115"/>
-    <w:bookmarkStart w:id="116" w:name="delete-vehicledelete"/>
+    <w:bookmarkEnd w:id="116"/>
+    <w:bookmarkStart w:id="117" w:name="delete-vehicledelete"/>
     <w:p>
       <w:pPr>
         <w:pStyle w:val="Heading3"/>
@@ -30337,8 +31332,8 @@
         <w:t xml:space="preserve">if the delete fails.</w:t>
       </w:r>
     </w:p>
-    <w:bookmarkEnd w:id="116"/>
-    <w:bookmarkStart w:id="117" w:name="get-vehiclevehicle_id"/>
+    <w:bookmarkEnd w:id="117"/>
+    <w:bookmarkStart w:id="118" w:name="get-vehiclevehicle_id"/>
     <w:p>
       <w:pPr>
         <w:pStyle w:val="Heading3"/>
@@ -30584,8 +31579,8 @@
         <w:t xml:space="preserve">insufficient privileges.</w:t>
       </w:r>
     </w:p>
-    <w:bookmarkEnd w:id="117"/>
-    <w:bookmarkStart w:id="118" w:name="get-vehiclepersonpersonal_info_id"/>
+    <w:bookmarkEnd w:id="118"/>
+    <w:bookmarkStart w:id="119" w:name="get-vehiclepersonpersonal_info_id"/>
     <w:p>
       <w:pPr>
         <w:pStyle w:val="Heading3"/>
@@ -30844,9 +31839,9 @@
         </w:pict>
       </w:r>
     </w:p>
-    <w:bookmarkEnd w:id="118"/>
     <w:bookmarkEnd w:id="119"/>
-    <w:bookmarkStart w:id="127" w:name="event-api"/>
+    <w:bookmarkEnd w:id="120"/>
+    <w:bookmarkStart w:id="128" w:name="event-api"/>
     <w:p>
       <w:pPr>
         <w:pStyle w:val="Heading2"/>
@@ -30905,7 +31900,7 @@
         <w:t xml:space="preserve">. Events are hosted by an account holder and carry a signed JWT-based invite link that guests can use (via the Event Register API) to self-register.</w:t>
       </w:r>
     </w:p>
-    <w:bookmarkStart w:id="120" w:name="post-eventcreate"/>
+    <w:bookmarkStart w:id="121" w:name="post-eventcreate"/>
     <w:p>
       <w:pPr>
         <w:pStyle w:val="Heading3"/>
@@ -31220,8 +32215,8 @@
         <w:t xml:space="preserve">if invite generation fails after the event insert.</w:t>
       </w:r>
     </w:p>
-    <w:bookmarkEnd w:id="120"/>
-    <w:bookmarkStart w:id="121" w:name="post-eventupdate"/>
+    <w:bookmarkEnd w:id="121"/>
+    <w:bookmarkStart w:id="122" w:name="post-eventupdate"/>
     <w:p>
       <w:pPr>
         <w:pStyle w:val="Heading3"/>
@@ -31509,8 +32504,8 @@
         <w:t xml:space="preserve">if the update fails.</w:t>
       </w:r>
     </w:p>
-    <w:bookmarkEnd w:id="121"/>
-    <w:bookmarkStart w:id="122" w:name="post-eventinvitegenerate"/>
+    <w:bookmarkEnd w:id="122"/>
+    <w:bookmarkStart w:id="123" w:name="post-eventinvitegenerate"/>
     <w:p>
       <w:pPr>
         <w:pStyle w:val="Heading3"/>
@@ -31759,8 +32754,8 @@
         <w:t xml:space="preserve">insufficient privileges.</w:t>
       </w:r>
     </w:p>
-    <w:bookmarkEnd w:id="122"/>
-    <w:bookmarkStart w:id="123" w:name="delete-eventdelete"/>
+    <w:bookmarkEnd w:id="123"/>
+    <w:bookmarkStart w:id="124" w:name="delete-eventdelete"/>
     <w:p>
       <w:pPr>
         <w:pStyle w:val="Heading3"/>
@@ -31994,8 +32989,8 @@
         <w:t xml:space="preserve">if the delete fails.</w:t>
       </w:r>
     </w:p>
-    <w:bookmarkEnd w:id="123"/>
-    <w:bookmarkStart w:id="124" w:name="get-eventevent_id"/>
+    <w:bookmarkEnd w:id="124"/>
+    <w:bookmarkStart w:id="125" w:name="get-eventevent_id"/>
     <w:p>
       <w:pPr>
         <w:pStyle w:val="Heading3"/>
@@ -32208,8 +33203,8 @@
         <w:t xml:space="preserve">insufficient privileges.</w:t>
       </w:r>
     </w:p>
-    <w:bookmarkEnd w:id="124"/>
-    <w:bookmarkStart w:id="125" w:name="get-eventcreatoraccount_holder_id"/>
+    <w:bookmarkEnd w:id="125"/>
+    <w:bookmarkStart w:id="126" w:name="get-eventcreatoraccount_holder_id"/>
     <w:p>
       <w:pPr>
         <w:pStyle w:val="Heading3"/>
@@ -32461,8 +33456,8 @@
         <w:t xml:space="preserve">insufficient privileges.</w:t>
       </w:r>
     </w:p>
-    <w:bookmarkEnd w:id="125"/>
-    <w:bookmarkStart w:id="126" w:name="get-eventestateestate_id"/>
+    <w:bookmarkEnd w:id="126"/>
+    <w:bookmarkStart w:id="127" w:name="get-eventestateestate_id"/>
     <w:p>
       <w:pPr>
         <w:pStyle w:val="Heading3"/>
@@ -32742,9 +33737,9 @@
         </w:pict>
       </w:r>
     </w:p>
-    <w:bookmarkEnd w:id="126"/>
     <w:bookmarkEnd w:id="127"/>
-    <w:bookmarkStart w:id="132" w:name="event-register-api"/>
+    <w:bookmarkEnd w:id="128"/>
+    <w:bookmarkStart w:id="133" w:name="event-register-api"/>
     <w:p>
       <w:pPr>
         <w:pStyle w:val="Heading2"/>
@@ -32818,7 +33813,7 @@
         <w:t xml:space="preserve">link records.</w:t>
       </w:r>
     </w:p>
-    <w:bookmarkStart w:id="128" w:name="post-event_registercreate"/>
+    <w:bookmarkStart w:id="129" w:name="post-event_registercreate"/>
     <w:p>
       <w:pPr>
         <w:pStyle w:val="Heading3"/>
@@ -33175,8 +34170,8 @@
         <w:t xml:space="preserve">’s estate can’t be determined.</w:t>
       </w:r>
     </w:p>
-    <w:bookmarkEnd w:id="128"/>
-    <w:bookmarkStart w:id="129" w:name="post-event_registerinviteuse"/>
+    <w:bookmarkEnd w:id="129"/>
+    <w:bookmarkStart w:id="130" w:name="post-event_registerinviteuse"/>
     <w:p>
       <w:pPr>
         <w:pStyle w:val="Heading3"/>
@@ -33545,8 +34540,8 @@
         <w:t xml:space="preserve">creator account not found.</w:t>
       </w:r>
     </w:p>
-    <w:bookmarkEnd w:id="129"/>
-    <w:bookmarkStart w:id="130" w:name="get-event_registereventevent_id"/>
+    <w:bookmarkEnd w:id="130"/>
+    <w:bookmarkStart w:id="131" w:name="get-event_registereventevent_id"/>
     <w:p>
       <w:pPr>
         <w:pStyle w:val="Heading3"/>
@@ -33801,8 +34796,8 @@
         <w:t xml:space="preserve">invalid pagination params.</w:t>
       </w:r>
     </w:p>
-    <w:bookmarkEnd w:id="130"/>
-    <w:bookmarkStart w:id="131" w:name="delete-event_registerdelete"/>
+    <w:bookmarkEnd w:id="131"/>
+    <w:bookmarkStart w:id="132" w:name="delete-event_registerdelete"/>
     <w:p>
       <w:pPr>
         <w:pStyle w:val="Heading3"/>
@@ -34100,9 +35095,9 @@
         </w:pict>
       </w:r>
     </w:p>
-    <w:bookmarkEnd w:id="131"/>
     <w:bookmarkEnd w:id="132"/>
-    <w:bookmarkStart w:id="136" w:name="face-api"/>
+    <w:bookmarkEnd w:id="133"/>
+    <w:bookmarkStart w:id="137" w:name="face-api"/>
     <w:p>
       <w:pPr>
         <w:pStyle w:val="Heading2"/>
@@ -34171,7 +35166,7 @@
         <w:t xml:space="preserve">).</w:t>
       </w:r>
     </w:p>
-    <w:bookmarkStart w:id="133" w:name="post-facesave"/>
+    <w:bookmarkStart w:id="134" w:name="post-facesave"/>
     <w:p>
       <w:pPr>
         <w:pStyle w:val="Heading3"/>
@@ -34717,8 +35712,8 @@
         <w:t xml:space="preserve">not set)</w:t>
       </w:r>
     </w:p>
-    <w:bookmarkEnd w:id="133"/>
-    <w:bookmarkStart w:id="134" w:name="post-facematch"/>
+    <w:bookmarkEnd w:id="134"/>
+    <w:bookmarkStart w:id="135" w:name="post-facematch"/>
     <w:p>
       <w:pPr>
         <w:pStyle w:val="Heading3"/>
@@ -35108,8 +36103,8 @@
         <w:t xml:space="preserve">rather than a proper API Gateway response dict — a latent bug that will surface as a Lambda invocation error rather than a clean HTTP error.</w:t>
       </w:r>
     </w:p>
-    <w:bookmarkEnd w:id="134"/>
-    <w:bookmarkStart w:id="135" w:name="post-faceupload"/>
+    <w:bookmarkEnd w:id="135"/>
+    <w:bookmarkStart w:id="136" w:name="post-faceupload"/>
     <w:p>
       <w:pPr>
         <w:pStyle w:val="Heading3"/>
@@ -35523,9 +36518,9 @@
         <w:t xml:space="preserve">)</w:t>
       </w:r>
     </w:p>
-    <w:bookmarkEnd w:id="135"/>
     <w:bookmarkEnd w:id="136"/>
-    <w:bookmarkStart w:id="139" w:name="device-token-api"/>
+    <w:bookmarkEnd w:id="137"/>
+    <w:bookmarkStart w:id="140" w:name="device-token-api"/>
     <w:p>
       <w:pPr>
         <w:pStyle w:val="Heading2"/>
@@ -35590,7 +36585,7 @@
         <w:t xml:space="preserve">.</w:t>
       </w:r>
     </w:p>
-    <w:bookmarkStart w:id="137" w:name="Xabcf2be7d406f009a6abea3c2a0c55ac26bd1a0"/>
+    <w:bookmarkStart w:id="138" w:name="Xabcf2be7d406f009a6abea3c2a0c55ac26bd1a0"/>
     <w:p>
       <w:pPr>
         <w:pStyle w:val="Heading3"/>
@@ -36050,8 +37045,8 @@
         <w:t xml:space="preserve">actually write a log entry despite the docstring’s intent.</w:t>
       </w:r>
     </w:p>
-    <w:bookmarkEnd w:id="137"/>
-    <w:bookmarkStart w:id="138" w:name="post-device_tokengenerate_tablet_token"/>
+    <w:bookmarkEnd w:id="138"/>
+    <w:bookmarkStart w:id="139" w:name="post-device_tokengenerate_tablet_token"/>
     <w:p>
       <w:pPr>
         <w:pStyle w:val="Heading3"/>
@@ -36453,9 +37448,9 @@
         <w:t xml:space="preserve">entry and commits before returning the token.</w:t>
       </w:r>
     </w:p>
-    <w:bookmarkEnd w:id="138"/>
     <w:bookmarkEnd w:id="139"/>
-    <w:bookmarkStart w:id="144" w:name="log-api"/>
+    <w:bookmarkEnd w:id="140"/>
+    <w:bookmarkStart w:id="145" w:name="log-api"/>
     <w:p>
       <w:pPr>
         <w:pStyle w:val="Heading2"/>
@@ -36592,7 +37587,7 @@
         <w:t xml:space="preserve">helper).</w:t>
       </w:r>
     </w:p>
-    <w:bookmarkStart w:id="140" w:name="get-logestateestate_id"/>
+    <w:bookmarkStart w:id="141" w:name="get-logestateestate_id"/>
     <w:p>
       <w:pPr>
         <w:pStyle w:val="Heading3"/>
@@ -37049,8 +38044,8 @@
         <w:t xml:space="preserve">— unhandled exception</w:t>
       </w:r>
     </w:p>
-    <w:bookmarkEnd w:id="140"/>
-    <w:bookmarkStart w:id="141" w:name="get-logaccount_holderaccount_holder_id"/>
+    <w:bookmarkEnd w:id="141"/>
+    <w:bookmarkStart w:id="142" w:name="get-logaccount_holderaccount_holder_id"/>
     <w:p>
       <w:pPr>
         <w:pStyle w:val="Heading3"/>
@@ -37646,8 +38641,8 @@
         <w:t xml:space="preserve">, see above)</w:t>
       </w:r>
     </w:p>
-    <w:bookmarkEnd w:id="141"/>
-    <w:bookmarkStart w:id="142" w:name="Xbd63c13c48239c361164cc6d48e7dbd4a8c4fe8"/>
+    <w:bookmarkEnd w:id="142"/>
+    <w:bookmarkStart w:id="143" w:name="Xbd63c13c48239c361164cc6d48e7dbd4a8c4fe8"/>
     <w:p>
       <w:pPr>
         <w:pStyle w:val="Heading3"/>
@@ -38182,8 +39177,8 @@
         <w:t xml:space="preserve">— unhandled exception</w:t>
       </w:r>
     </w:p>
-    <w:bookmarkEnd w:id="142"/>
-    <w:bookmarkStart w:id="143" w:name="get-logsearch_estateestate_id"/>
+    <w:bookmarkEnd w:id="143"/>
+    <w:bookmarkStart w:id="144" w:name="get-logsearch_estateestate_id"/>
     <w:p>
       <w:pPr>
         <w:pStyle w:val="Heading3"/>
@@ -38784,9 +39779,9 @@
         <w:t xml:space="preserve">— unhandled exception</w:t>
       </w:r>
     </w:p>
-    <w:bookmarkEnd w:id="143"/>
     <w:bookmarkEnd w:id="144"/>
-    <w:bookmarkStart w:id="148" w:name="account-type-privilege-link-api"/>
+    <w:bookmarkEnd w:id="145"/>
+    <w:bookmarkStart w:id="149" w:name="account-type-privilege-link-api"/>
     <w:p>
       <w:pPr>
         <w:pStyle w:val="Heading2"/>
@@ -38887,7 +39882,7 @@
         <w:t xml:space="preserve">— this is a global-admin-only API with no estate-scoped privilege fallback.</w:t>
       </w:r>
     </w:p>
-    <w:bookmarkStart w:id="145" w:name="post-account_type_privilege_linkcreate"/>
+    <w:bookmarkStart w:id="146" w:name="post-account_type_privilege_linkcreate"/>
     <w:p>
       <w:pPr>
         <w:pStyle w:val="Heading3"/>
@@ -39313,8 +40308,8 @@
         <w:t xml:space="preserve">— unhandled exception</w:t>
       </w:r>
     </w:p>
-    <w:bookmarkEnd w:id="145"/>
-    <w:bookmarkStart w:id="146" w:name="delete-account_type_privilege_linkremove"/>
+    <w:bookmarkEnd w:id="146"/>
+    <w:bookmarkStart w:id="147" w:name="delete-account_type_privilege_linkremove"/>
     <w:p>
       <w:pPr>
         <w:pStyle w:val="Heading3"/>
@@ -39656,8 +40651,8 @@
         <w:t xml:space="preserve">— unhandled exception</w:t>
       </w:r>
     </w:p>
-    <w:bookmarkEnd w:id="146"/>
-    <w:bookmarkStart w:id="147" w:name="X708bbad766479144c597012eb1113118b1f20c9"/>
+    <w:bookmarkEnd w:id="147"/>
+    <w:bookmarkStart w:id="148" w:name="X708bbad766479144c597012eb1113118b1f20c9"/>
     <w:p>
       <w:pPr>
         <w:pStyle w:val="Heading3"/>
@@ -40018,9 +41013,9 @@
         <w:t xml:space="preserve">— unhandled exception</w:t>
       </w:r>
     </w:p>
-    <w:bookmarkEnd w:id="147"/>
     <w:bookmarkEnd w:id="148"/>
-    <w:bookmarkStart w:id="154" w:name="gate-access-group-link-api"/>
+    <w:bookmarkEnd w:id="149"/>
+    <w:bookmarkStart w:id="155" w:name="gate-access-group-link-api"/>
     <w:p>
       <w:pPr>
         <w:pStyle w:val="Heading2"/>
@@ -40175,7 +41170,7 @@
         <w:t xml:space="preserve">) resolved for the gate’s or access group’s estate.</w:t>
       </w:r>
     </w:p>
-    <w:bookmarkStart w:id="149" w:name="post-gate_access_group_linkcreate"/>
+    <w:bookmarkStart w:id="150" w:name="post-gate_access_group_linkcreate"/>
     <w:p>
       <w:pPr>
         <w:pStyle w:val="Heading3"/>
@@ -40658,8 +41653,8 @@
         <w:t xml:space="preserve">— unhandled exception</w:t>
       </w:r>
     </w:p>
-    <w:bookmarkEnd w:id="149"/>
-    <w:bookmarkStart w:id="150" w:name="post-gate_access_group_linkupdate"/>
+    <w:bookmarkEnd w:id="150"/>
+    <w:bookmarkStart w:id="151" w:name="post-gate_access_group_linkupdate"/>
     <w:p>
       <w:pPr>
         <w:pStyle w:val="Heading3"/>
@@ -41088,8 +42083,8 @@
         <w:t xml:space="preserve">— unhandled exception</w:t>
       </w:r>
     </w:p>
-    <w:bookmarkEnd w:id="150"/>
-    <w:bookmarkStart w:id="151" w:name="delete-gate_access_group_linkremove"/>
+    <w:bookmarkEnd w:id="151"/>
+    <w:bookmarkStart w:id="152" w:name="delete-gate_access_group_linkremove"/>
     <w:p>
       <w:pPr>
         <w:pStyle w:val="Heading3"/>
@@ -41455,8 +42450,8 @@
         <w:t xml:space="preserve">— unhandled exception</w:t>
       </w:r>
     </w:p>
-    <w:bookmarkEnd w:id="151"/>
-    <w:bookmarkStart w:id="152" w:name="get-gate_access_group_linkgategate_id"/>
+    <w:bookmarkEnd w:id="152"/>
+    <w:bookmarkStart w:id="153" w:name="get-gate_access_group_linkgategate_id"/>
     <w:p>
       <w:pPr>
         <w:pStyle w:val="Heading3"/>
@@ -41859,8 +42854,8 @@
         <w:t xml:space="preserve">— unhandled exception</w:t>
       </w:r>
     </w:p>
-    <w:bookmarkEnd w:id="152"/>
-    <w:bookmarkStart w:id="153" w:name="Xb2db36ac34e7feb27efaf154fecaa698b484cb0"/>
+    <w:bookmarkEnd w:id="153"/>
+    <w:bookmarkStart w:id="154" w:name="Xb2db36ac34e7feb27efaf154fecaa698b484cb0"/>
     <w:p>
       <w:pPr>
         <w:pStyle w:val="Heading3"/>
@@ -42281,9 +43276,9 @@
         <w:t xml:space="preserve">— unhandled exception</w:t>
       </w:r>
     </w:p>
-    <w:bookmarkEnd w:id="153"/>
     <w:bookmarkEnd w:id="154"/>
     <w:bookmarkEnd w:id="155"/>
+    <w:bookmarkEnd w:id="156"/>
     <w:sectPr>
       <w:footnotePr>
         <w:numRestart w:val="eachSect"/>

</xml_diff>